<commit_message>
sprint report1 document created
</commit_message>
<xml_diff>
--- a/srDesign_SprintReport1.docx
+++ b/srDesign_SprintReport1.docx
@@ -63,21 +63,14 @@
         </w:numPr>
       </w:pPr>
       <w:r>
-        <w:t xml:space="preserve">Kevin </w:t>
-      </w:r>
-      <w:proofErr w:type="spellStart"/>
-      <w:r>
-        <w:t>Worner</w:t>
-      </w:r>
-      <w:proofErr w:type="spellEnd"/>
+        <w:t>Kevin Worner</w:t>
+      </w:r>
     </w:p>
     <w:p>
       <w:pPr>
         <w:pStyle w:val="Heading1"/>
         <w:rPr>
           <w:rFonts w:eastAsia="Times New Roman"/>
-          <w:sz w:val="27"/>
-          <w:szCs w:val="27"/>
         </w:rPr>
       </w:pPr>
       <w:r>
@@ -90,271 +83,440 @@
         <w:rPr>
           <w:rFonts w:eastAsia="Times New Roman"/>
         </w:rPr>
-        <w:t>ustomer</w:t>
-      </w:r>
-      <w:bookmarkStart w:id="0" w:name="_GoBack"/>
-      <w:bookmarkEnd w:id="0"/>
-      <w:r>
-        <w:rPr>
-          <w:rFonts w:eastAsia="Times New Roman"/>
-        </w:rPr>
+        <w:t xml:space="preserve">ustomer </w:t>
+      </w:r>
+    </w:p>
+    <w:p>
+      <w:r>
+        <w:t xml:space="preserve">Innovative Systems </w:t>
+      </w:r>
+    </w:p>
+    <w:p>
+      <w:pPr>
+        <w:spacing w:before="100" w:beforeAutospacing="1" w:after="100" w:afterAutospacing="1" w:line="240" w:lineRule="auto"/>
+        <w:rPr>
+          <w:rStyle w:val="Heading1Char"/>
+        </w:rPr>
+      </w:pPr>
+      <w:r>
+        <w:rPr>
+          <w:rStyle w:val="Heading1Char"/>
+        </w:rPr>
+        <w:t>Customer D</w:t>
+      </w:r>
+      <w:r>
+        <w:rPr>
+          <w:rStyle w:val="Heading1Char"/>
+        </w:rPr>
+        <w:t>escription</w:t>
+      </w:r>
+    </w:p>
+    <w:p>
+      <w:pPr>
+        <w:spacing w:before="100" w:beforeAutospacing="1" w:after="100" w:afterAutospacing="1" w:line="240" w:lineRule="auto"/>
+        <w:rPr>
+          <w:rFonts w:asciiTheme="majorHAnsi" w:eastAsiaTheme="majorEastAsia" w:hAnsiTheme="majorHAnsi" w:cstheme="majorBidi"/>
+          <w:color w:val="365F91" w:themeColor="accent1" w:themeShade="BF"/>
+          <w:sz w:val="28"/>
+          <w:szCs w:val="28"/>
+        </w:rPr>
+      </w:pPr>
+      <w:r>
+        <w:t>Innovative Systems is a developer and provider of software and hardware for the independent telecommunications industry. More than 1200 systems are deployed at locations across the United States and Canada.</w:t>
+      </w:r>
+      <w:r>
         <w:t xml:space="preserve"> </w:t>
       </w:r>
     </w:p>
     <w:p>
       <w:pPr>
+        <w:pStyle w:val="Heading1"/>
+        <w:rPr>
+          <w:rFonts w:eastAsia="Times New Roman"/>
+        </w:rPr>
+      </w:pPr>
+      <w:r>
+        <w:rPr>
+          <w:rFonts w:eastAsia="Times New Roman"/>
+        </w:rPr>
+        <w:t>G</w:t>
+      </w:r>
+      <w:r>
+        <w:rPr>
+          <w:rFonts w:eastAsia="Times New Roman"/>
+        </w:rPr>
+        <w:t xml:space="preserve">oal </w:t>
+      </w:r>
+      <w:r>
+        <w:rPr>
+          <w:rFonts w:eastAsia="Times New Roman"/>
+        </w:rPr>
+        <w:t>of</w:t>
+      </w:r>
+      <w:r>
+        <w:rPr>
+          <w:rFonts w:eastAsia="Times New Roman"/>
+        </w:rPr>
+        <w:t xml:space="preserve"> </w:t>
+      </w:r>
+      <w:r>
+        <w:rPr>
+          <w:rFonts w:eastAsia="Times New Roman"/>
+        </w:rPr>
+        <w:t>P</w:t>
+      </w:r>
+      <w:r>
+        <w:rPr>
+          <w:rFonts w:eastAsia="Times New Roman"/>
+        </w:rPr>
+        <w:t>roject</w:t>
+      </w:r>
+    </w:p>
+    <w:p>
+      <w:r>
+        <w:t>The goal of this project is to design a single game server that communicates with a STB display mechanism. Also this project will provide a tool for future STB game developers to deploy games in a simple standardized way.</w:t>
+      </w:r>
+    </w:p>
+    <w:p>
+      <w:pPr>
+        <w:pStyle w:val="Heading1"/>
+        <w:rPr>
+          <w:rFonts w:eastAsia="Times New Roman"/>
+        </w:rPr>
+      </w:pPr>
+      <w:r>
+        <w:rPr>
+          <w:rFonts w:eastAsia="Times New Roman"/>
+        </w:rPr>
+        <w:t>C</w:t>
+      </w:r>
+      <w:r>
+        <w:rPr>
+          <w:rFonts w:eastAsia="Times New Roman"/>
+        </w:rPr>
+        <w:t xml:space="preserve">ustomer </w:t>
+      </w:r>
+      <w:r>
+        <w:rPr>
+          <w:rFonts w:eastAsia="Times New Roman"/>
+        </w:rPr>
+        <w:t>N</w:t>
+      </w:r>
+      <w:r>
+        <w:rPr>
+          <w:rFonts w:eastAsia="Times New Roman"/>
+        </w:rPr>
+        <w:t>eeds</w:t>
+      </w:r>
+    </w:p>
+    <w:p>
+      <w:pPr>
+        <w:pStyle w:val="ListParagraph"/>
         <w:numPr>
           <w:ilvl w:val="0"/>
-          <w:numId w:val="1"/>
+          <w:numId w:val="3"/>
         </w:numPr>
-        <w:spacing w:before="100" w:beforeAutospacing="1" w:after="100" w:afterAutospacing="1" w:line="240" w:lineRule="auto"/>
-        <w:rPr>
-          <w:rFonts w:ascii="Times New Roman" w:eastAsia="Times New Roman" w:hAnsi="Times New Roman" w:cs="Times New Roman"/>
-          <w:color w:val="000000"/>
-          <w:sz w:val="27"/>
-          <w:szCs w:val="27"/>
-        </w:rPr>
-      </w:pPr>
-      <w:r>
-        <w:rPr>
-          <w:rFonts w:ascii="Times New Roman" w:eastAsia="Times New Roman" w:hAnsi="Times New Roman" w:cs="Times New Roman"/>
-          <w:color w:val="000000"/>
-          <w:sz w:val="27"/>
-          <w:szCs w:val="27"/>
-        </w:rPr>
-        <w:t>Customer description - overview of the client </w:t>
-      </w:r>
-    </w:p>
-    <w:p>
-      <w:pPr>
+      </w:pPr>
+      <w:r>
+        <w:t>Single Game Server:</w:t>
+      </w:r>
+    </w:p>
+    <w:p>
+      <w:pPr>
+        <w:pStyle w:val="ListParagraph"/>
         <w:numPr>
           <w:ilvl w:val="1"/>
-          <w:numId w:val="1"/>
+          <w:numId w:val="3"/>
         </w:numPr>
-        <w:spacing w:before="100" w:beforeAutospacing="1" w:after="100" w:afterAutospacing="1" w:line="240" w:lineRule="auto"/>
-        <w:rPr>
-          <w:rFonts w:ascii="Times New Roman" w:eastAsia="Times New Roman" w:hAnsi="Times New Roman" w:cs="Times New Roman"/>
-          <w:color w:val="000000"/>
-          <w:sz w:val="27"/>
-          <w:szCs w:val="27"/>
-        </w:rPr>
-      </w:pPr>
-      <w:r>
-        <w:rPr>
-          <w:rFonts w:ascii="Times New Roman" w:eastAsia="Times New Roman" w:hAnsi="Times New Roman" w:cs="Times New Roman"/>
-          <w:color w:val="000000"/>
-          <w:sz w:val="27"/>
-          <w:szCs w:val="27"/>
-        </w:rPr>
-        <w:t>Description of sponsoring customer</w:t>
-      </w:r>
-    </w:p>
-    <w:p>
-      <w:pPr>
+      </w:pPr>
+      <w:r>
+        <w:t>Communication Protocol</w:t>
+      </w:r>
+    </w:p>
+    <w:p>
+      <w:pPr>
+        <w:pStyle w:val="ListParagraph"/>
         <w:numPr>
           <w:ilvl w:val="1"/>
-          <w:numId w:val="1"/>
+          <w:numId w:val="3"/>
         </w:numPr>
-        <w:spacing w:before="100" w:beforeAutospacing="1" w:after="100" w:afterAutospacing="1" w:line="240" w:lineRule="auto"/>
-        <w:rPr>
-          <w:rFonts w:ascii="Times New Roman" w:eastAsia="Times New Roman" w:hAnsi="Times New Roman" w:cs="Times New Roman"/>
-          <w:color w:val="000000"/>
-          <w:sz w:val="27"/>
-          <w:szCs w:val="27"/>
-        </w:rPr>
-      </w:pPr>
-      <w:r>
-        <w:rPr>
-          <w:rFonts w:ascii="Times New Roman" w:eastAsia="Times New Roman" w:hAnsi="Times New Roman" w:cs="Times New Roman"/>
-          <w:color w:val="000000"/>
-          <w:sz w:val="27"/>
-          <w:szCs w:val="27"/>
-        </w:rPr>
-        <w:t>Brief statement of customer's problem or goal for this project</w:t>
-      </w:r>
-    </w:p>
-    <w:p>
-      <w:pPr>
+      </w:pPr>
+      <w:r>
+        <w:t>Game Logic</w:t>
+      </w:r>
+    </w:p>
+    <w:p>
+      <w:pPr>
+        <w:pStyle w:val="ListParagraph"/>
         <w:numPr>
           <w:ilvl w:val="1"/>
-          <w:numId w:val="1"/>
+          <w:numId w:val="3"/>
         </w:numPr>
+      </w:pPr>
+      <w:r>
+        <w:t>Game Resources</w:t>
+      </w:r>
+    </w:p>
+    <w:p>
+      <w:pPr>
+        <w:pStyle w:val="ListParagraph"/>
+        <w:numPr>
+          <w:ilvl w:val="1"/>
+          <w:numId w:val="3"/>
+        </w:numPr>
+      </w:pPr>
+      <w:r>
+        <w:t>Game AI</w:t>
+      </w:r>
+    </w:p>
+    <w:p>
+      <w:pPr>
+        <w:pStyle w:val="ListParagraph"/>
+        <w:numPr>
+          <w:ilvl w:val="1"/>
+          <w:numId w:val="3"/>
+        </w:numPr>
+      </w:pPr>
+      <w:r>
+        <w:t>Supporting 100-1000 users</w:t>
+      </w:r>
+    </w:p>
+    <w:p>
+      <w:pPr>
+        <w:pStyle w:val="ListParagraph"/>
+        <w:numPr>
+          <w:ilvl w:val="0"/>
+          <w:numId w:val="3"/>
+        </w:numPr>
+      </w:pPr>
+      <w:r>
+        <w:t>STB Display Mechanism</w:t>
+      </w:r>
+    </w:p>
+    <w:p>
+      <w:pPr>
+        <w:pStyle w:val="ListParagraph"/>
+        <w:numPr>
+          <w:ilvl w:val="1"/>
+          <w:numId w:val="3"/>
+        </w:numPr>
+      </w:pPr>
+      <w:r>
+        <w:t>Modular</w:t>
+      </w:r>
+    </w:p>
+    <w:p>
+      <w:pPr>
+        <w:pStyle w:val="ListParagraph"/>
+        <w:numPr>
+          <w:ilvl w:val="1"/>
+          <w:numId w:val="3"/>
+        </w:numPr>
+      </w:pPr>
+      <w:r>
+        <w:t>Dynamic at Runtime</w:t>
+      </w:r>
+    </w:p>
+    <w:p>
+      <w:pPr>
+        <w:pStyle w:val="ListParagraph"/>
+        <w:numPr>
+          <w:ilvl w:val="0"/>
+          <w:numId w:val="3"/>
+        </w:numPr>
+      </w:pPr>
+      <w:r>
+        <w:t>Virtual APMAX</w:t>
+      </w:r>
+    </w:p>
+    <w:p>
+      <w:pPr>
+        <w:pStyle w:val="ListParagraph"/>
+        <w:numPr>
+          <w:ilvl w:val="1"/>
+          <w:numId w:val="3"/>
+        </w:numPr>
+      </w:pPr>
+      <w:r>
+        <w:t>Communication Protocol</w:t>
+      </w:r>
+    </w:p>
+    <w:p>
+      <w:pPr>
+        <w:pStyle w:val="ListParagraph"/>
+        <w:numPr>
+          <w:ilvl w:val="2"/>
+          <w:numId w:val="3"/>
+        </w:numPr>
+      </w:pPr>
+      <w:r>
+        <w:t>STB -&gt; Communication Layer 1 -&gt; APMAX</w:t>
+      </w:r>
+    </w:p>
+    <w:p>
+      <w:pPr>
+        <w:pStyle w:val="ListParagraph"/>
+        <w:numPr>
+          <w:ilvl w:val="2"/>
+          <w:numId w:val="3"/>
+        </w:numPr>
+      </w:pPr>
+      <w:r>
+        <w:t>APMAX -&gt; Communication Layer 1 -&gt; STB</w:t>
+      </w:r>
+    </w:p>
+    <w:p>
+      <w:pPr>
+        <w:pStyle w:val="ListParagraph"/>
+        <w:numPr>
+          <w:ilvl w:val="1"/>
+          <w:numId w:val="3"/>
+        </w:numPr>
+      </w:pPr>
+      <w:r>
+        <w:t>Secure Communication</w:t>
+      </w:r>
+    </w:p>
+    <w:p>
+      <w:pPr>
+        <w:pStyle w:val="ListParagraph"/>
+        <w:numPr>
+          <w:ilvl w:val="0"/>
+          <w:numId w:val="3"/>
+        </w:numPr>
+      </w:pPr>
+      <w:r>
+        <w:t>Unit Testing</w:t>
+      </w:r>
+    </w:p>
+    <w:p>
+      <w:pPr>
+        <w:pStyle w:val="Heading1"/>
+        <w:rPr>
+          <w:rFonts w:eastAsia="Times New Roman"/>
+        </w:rPr>
+      </w:pPr>
+      <w:r>
+        <w:rPr>
+          <w:rFonts w:eastAsia="Times New Roman"/>
+        </w:rPr>
+        <w:lastRenderedPageBreak/>
+        <w:t>Overview of the P</w:t>
+      </w:r>
+      <w:r>
+        <w:rPr>
+          <w:rFonts w:eastAsia="Times New Roman"/>
+        </w:rPr>
+        <w:t>roject</w:t>
+      </w:r>
+    </w:p>
+    <w:p>
+      <w:pPr>
+        <w:pStyle w:val="Heading1"/>
+        <w:rPr>
+          <w:rFonts w:eastAsia="Times New Roman"/>
+        </w:rPr>
+      </w:pPr>
+      <w:r>
+        <w:rPr>
+          <w:rFonts w:eastAsia="Times New Roman"/>
+        </w:rPr>
+        <w:t>Project environment </w:t>
+      </w:r>
+    </w:p>
+    <w:p>
+      <w:pPr>
+        <w:pStyle w:val="Heading2"/>
+        <w:rPr>
+          <w:rFonts w:eastAsia="Times New Roman"/>
+          <w:color w:val="365F91" w:themeColor="accent1" w:themeShade="BF"/>
+          <w:sz w:val="28"/>
+          <w:szCs w:val="28"/>
+        </w:rPr>
+      </w:pPr>
+      <w:r>
+        <w:rPr>
+          <w:rFonts w:eastAsia="Times New Roman"/>
+        </w:rPr>
+        <w:t>Project B</w:t>
+      </w:r>
+      <w:r>
+        <w:rPr>
+          <w:rFonts w:eastAsia="Times New Roman"/>
+        </w:rPr>
+        <w:t>oundaries</w:t>
+      </w:r>
+    </w:p>
+    <w:p>
+      <w:pPr>
+        <w:pStyle w:val="Heading2"/>
+        <w:rPr>
+          <w:rFonts w:eastAsia="Times New Roman"/>
+        </w:rPr>
+      </w:pPr>
+      <w:r>
+        <w:rPr>
+          <w:rFonts w:eastAsia="Times New Roman"/>
+        </w:rPr>
+        <w:t>Project C</w:t>
+      </w:r>
+      <w:r>
+        <w:rPr>
+          <w:rFonts w:eastAsia="Times New Roman"/>
+        </w:rPr>
+        <w:t>ontext</w:t>
+      </w:r>
+    </w:p>
+    <w:p>
+      <w:pPr>
+        <w:pStyle w:val="Heading3"/>
+        <w:rPr>
+          <w:rFonts w:eastAsia="Times New Roman"/>
+        </w:rPr>
+      </w:pPr>
+      <w:r>
+        <w:rPr>
+          <w:rFonts w:eastAsia="Times New Roman"/>
+        </w:rPr>
+        <w:t>Technical Environment</w:t>
+      </w:r>
+    </w:p>
+    <w:p>
+      <w:pPr>
+        <w:pStyle w:val="Heading3"/>
+        <w:rPr>
+          <w:rFonts w:eastAsia="Times New Roman"/>
+        </w:rPr>
+      </w:pPr>
+      <w:r>
+        <w:rPr>
+          <w:rFonts w:eastAsia="Times New Roman"/>
+        </w:rPr>
+        <w:t>Current systems overview</w:t>
+      </w:r>
+    </w:p>
+    <w:p>
+      <w:pPr>
         <w:spacing w:before="100" w:beforeAutospacing="1" w:after="100" w:afterAutospacing="1" w:line="240" w:lineRule="auto"/>
-        <w:rPr>
-          <w:rFonts w:ascii="Times New Roman" w:eastAsia="Times New Roman" w:hAnsi="Times New Roman" w:cs="Times New Roman"/>
-          <w:color w:val="000000"/>
-          <w:sz w:val="27"/>
-          <w:szCs w:val="27"/>
-        </w:rPr>
-      </w:pPr>
-      <w:r>
         <w:rPr>
           <w:rFonts w:ascii="Times New Roman" w:eastAsia="Times New Roman" w:hAnsi="Times New Roman" w:cs="Times New Roman"/>
           <w:color w:val="000000"/>
           <w:sz w:val="24"/>
           <w:szCs w:val="24"/>
         </w:rPr>
-        <w:t>List the customer needs</w:t>
-      </w:r>
-    </w:p>
-    <w:p>
-      <w:pPr>
-        <w:numPr>
-          <w:ilvl w:val="0"/>
-          <w:numId w:val="1"/>
-        </w:numPr>
-        <w:spacing w:before="100" w:beforeAutospacing="1" w:after="100" w:afterAutospacing="1" w:line="240" w:lineRule="auto"/>
-        <w:rPr>
-          <w:rFonts w:ascii="Times New Roman" w:eastAsia="Times New Roman" w:hAnsi="Times New Roman" w:cs="Times New Roman"/>
-          <w:color w:val="000000"/>
-          <w:sz w:val="27"/>
-          <w:szCs w:val="27"/>
-        </w:rPr>
-      </w:pPr>
-      <w:r>
-        <w:rPr>
-          <w:rFonts w:ascii="Times New Roman" w:eastAsia="Times New Roman" w:hAnsi="Times New Roman" w:cs="Times New Roman"/>
-          <w:color w:val="000000"/>
-          <w:sz w:val="27"/>
-          <w:szCs w:val="27"/>
-        </w:rPr>
-        <w:t>Overview of the project</w:t>
-      </w:r>
-    </w:p>
-    <w:p>
-      <w:pPr>
-        <w:numPr>
-          <w:ilvl w:val="0"/>
-          <w:numId w:val="1"/>
-        </w:numPr>
-        <w:spacing w:before="100" w:beforeAutospacing="1" w:after="100" w:afterAutospacing="1" w:line="240" w:lineRule="auto"/>
-        <w:rPr>
-          <w:rFonts w:ascii="Times New Roman" w:eastAsia="Times New Roman" w:hAnsi="Times New Roman" w:cs="Times New Roman"/>
-          <w:color w:val="000000"/>
-          <w:sz w:val="27"/>
-          <w:szCs w:val="27"/>
-        </w:rPr>
-      </w:pPr>
-      <w:r>
-        <w:rPr>
-          <w:rFonts w:ascii="Times New Roman" w:eastAsia="Times New Roman" w:hAnsi="Times New Roman" w:cs="Times New Roman"/>
-          <w:color w:val="000000"/>
-          <w:sz w:val="27"/>
-          <w:szCs w:val="27"/>
-        </w:rPr>
-        <w:t>Project environment </w:t>
-      </w:r>
-    </w:p>
-    <w:p>
-      <w:pPr>
-        <w:numPr>
-          <w:ilvl w:val="1"/>
-          <w:numId w:val="1"/>
-        </w:numPr>
-        <w:spacing w:before="100" w:beforeAutospacing="1" w:after="100" w:afterAutospacing="1" w:line="240" w:lineRule="auto"/>
-        <w:rPr>
-          <w:rFonts w:ascii="Times New Roman" w:eastAsia="Times New Roman" w:hAnsi="Times New Roman" w:cs="Times New Roman"/>
-          <w:color w:val="000000"/>
-          <w:sz w:val="27"/>
-          <w:szCs w:val="27"/>
-        </w:rPr>
-      </w:pPr>
-      <w:r>
-        <w:rPr>
-          <w:rFonts w:ascii="Times New Roman" w:eastAsia="Times New Roman" w:hAnsi="Times New Roman" w:cs="Times New Roman"/>
-          <w:color w:val="000000"/>
-          <w:sz w:val="27"/>
-          <w:szCs w:val="27"/>
-        </w:rPr>
-        <w:t>Project boundaries</w:t>
-      </w:r>
-    </w:p>
-    <w:p>
-      <w:pPr>
-        <w:numPr>
-          <w:ilvl w:val="1"/>
-          <w:numId w:val="1"/>
-        </w:numPr>
-        <w:spacing w:before="100" w:beforeAutospacing="1" w:after="100" w:afterAutospacing="1" w:line="240" w:lineRule="auto"/>
-        <w:rPr>
-          <w:rFonts w:ascii="Times New Roman" w:eastAsia="Times New Roman" w:hAnsi="Times New Roman" w:cs="Times New Roman"/>
-          <w:color w:val="000000"/>
-          <w:sz w:val="27"/>
-          <w:szCs w:val="27"/>
-        </w:rPr>
-      </w:pPr>
-      <w:r>
-        <w:rPr>
-          <w:rFonts w:ascii="Times New Roman" w:eastAsia="Times New Roman" w:hAnsi="Times New Roman" w:cs="Times New Roman"/>
-          <w:color w:val="000000"/>
-          <w:sz w:val="27"/>
-          <w:szCs w:val="27"/>
-        </w:rPr>
-        <w:t>Project context</w:t>
-      </w:r>
-    </w:p>
-    <w:p>
-      <w:pPr>
-        <w:numPr>
-          <w:ilvl w:val="2"/>
-          <w:numId w:val="1"/>
-        </w:numPr>
-        <w:spacing w:before="100" w:beforeAutospacing="1" w:after="100" w:afterAutospacing="1" w:line="240" w:lineRule="auto"/>
-        <w:rPr>
-          <w:rFonts w:ascii="Times New Roman" w:eastAsia="Times New Roman" w:hAnsi="Times New Roman" w:cs="Times New Roman"/>
-          <w:color w:val="000000"/>
-          <w:sz w:val="27"/>
-          <w:szCs w:val="27"/>
-        </w:rPr>
-      </w:pPr>
-      <w:r>
-        <w:rPr>
-          <w:rFonts w:ascii="Times New Roman" w:eastAsia="Times New Roman" w:hAnsi="Times New Roman" w:cs="Times New Roman"/>
-          <w:color w:val="000000"/>
-          <w:sz w:val="27"/>
-          <w:szCs w:val="27"/>
-        </w:rPr>
-        <w:t>Technical Environment</w:t>
-      </w:r>
-    </w:p>
-    <w:p>
-      <w:pPr>
-        <w:numPr>
-          <w:ilvl w:val="2"/>
-          <w:numId w:val="1"/>
-        </w:numPr>
-        <w:spacing w:before="100" w:beforeAutospacing="1" w:after="100" w:afterAutospacing="1" w:line="240" w:lineRule="auto"/>
-        <w:rPr>
-          <w:rFonts w:ascii="Times New Roman" w:eastAsia="Times New Roman" w:hAnsi="Times New Roman" w:cs="Times New Roman"/>
-          <w:color w:val="000000"/>
-          <w:sz w:val="27"/>
-          <w:szCs w:val="27"/>
-        </w:rPr>
-      </w:pPr>
-      <w:r>
-        <w:rPr>
-          <w:rFonts w:ascii="Times New Roman" w:eastAsia="Times New Roman" w:hAnsi="Times New Roman" w:cs="Times New Roman"/>
-          <w:color w:val="000000"/>
-          <w:sz w:val="27"/>
-          <w:szCs w:val="27"/>
-        </w:rPr>
-        <w:t>Current systems overview</w:t>
-      </w:r>
-    </w:p>
-    <w:p>
-      <w:pPr>
-        <w:numPr>
-          <w:ilvl w:val="0"/>
-          <w:numId w:val="1"/>
-        </w:numPr>
-        <w:spacing w:before="100" w:beforeAutospacing="1" w:after="100" w:afterAutospacing="1" w:line="240" w:lineRule="auto"/>
-        <w:rPr>
-          <w:rFonts w:ascii="Times New Roman" w:eastAsia="Times New Roman" w:hAnsi="Times New Roman" w:cs="Times New Roman"/>
-          <w:color w:val="000000"/>
-          <w:sz w:val="27"/>
-          <w:szCs w:val="27"/>
-        </w:rPr>
-      </w:pPr>
+      </w:pPr>
+      <w:r>
+        <w:rPr>
+          <w:rStyle w:val="Heading1Char"/>
+        </w:rPr>
+        <w:t>Project D</w:t>
+      </w:r>
+      <w:r>
+        <w:rPr>
+          <w:rStyle w:val="Heading1Char"/>
+        </w:rPr>
+        <w:t>eliverables</w:t>
+      </w:r>
       <w:r>
         <w:rPr>
           <w:rFonts w:ascii="Times New Roman" w:eastAsia="Times New Roman" w:hAnsi="Times New Roman" w:cs="Times New Roman"/>
@@ -362,102 +524,119 @@
           <w:sz w:val="24"/>
           <w:szCs w:val="24"/>
         </w:rPr>
-        <w:t xml:space="preserve">Identify the project deliverables (e.g. prototype, documentation, CDROM with program code, </w:t>
-      </w:r>
-      <w:proofErr w:type="spellStart"/>
-      <w:r>
+        <w:t xml:space="preserve"> </w:t>
+      </w:r>
+    </w:p>
+    <w:p>
+      <w:pPr>
+        <w:pStyle w:val="ListParagraph"/>
+        <w:numPr>
+          <w:ilvl w:val="0"/>
+          <w:numId w:val="6"/>
+        </w:numPr>
+      </w:pPr>
+      <w:r>
+        <w:t>Client Contract</w:t>
+      </w:r>
+    </w:p>
+    <w:p>
+      <w:pPr>
+        <w:pStyle w:val="ListParagraph"/>
+        <w:numPr>
+          <w:ilvl w:val="0"/>
+          <w:numId w:val="6"/>
+        </w:numPr>
+      </w:pPr>
+      <w:r>
+        <w:t>Mission Statement</w:t>
+      </w:r>
+    </w:p>
+    <w:p>
+      <w:pPr>
+        <w:pStyle w:val="ListParagraph"/>
+        <w:numPr>
+          <w:ilvl w:val="0"/>
+          <w:numId w:val="6"/>
+        </w:numPr>
+      </w:pPr>
+      <w:r>
+        <w:t>Requirement Document</w:t>
+      </w:r>
+    </w:p>
+    <w:p>
+      <w:pPr>
+        <w:pStyle w:val="ListParagraph"/>
+        <w:numPr>
+          <w:ilvl w:val="0"/>
+          <w:numId w:val="6"/>
+        </w:numPr>
+      </w:pPr>
+      <w:r>
+        <w:t>Design Document</w:t>
+      </w:r>
+    </w:p>
+    <w:p>
+      <w:pPr>
+        <w:pStyle w:val="ListParagraph"/>
+        <w:numPr>
+          <w:ilvl w:val="0"/>
+          <w:numId w:val="6"/>
+        </w:numPr>
+      </w:pPr>
+      <w:r>
+        <w:t>CONOPS Document</w:t>
+      </w:r>
+    </w:p>
+    <w:p>
+      <w:pPr>
+        <w:pStyle w:val="Heading1"/>
+        <w:rPr>
+          <w:rFonts w:eastAsiaTheme="minorHAnsi"/>
+        </w:rPr>
+      </w:pPr>
+      <w:r>
+        <w:t>Backlog Outline</w:t>
+      </w:r>
+    </w:p>
+    <w:p>
+      <w:pPr>
+        <w:spacing w:before="100" w:beforeAutospacing="1" w:after="100" w:afterAutospacing="1" w:line="240" w:lineRule="auto"/>
         <w:rPr>
           <w:rFonts w:ascii="Times New Roman" w:eastAsia="Times New Roman" w:hAnsi="Times New Roman" w:cs="Times New Roman"/>
           <w:color w:val="000000"/>
           <w:sz w:val="24"/>
           <w:szCs w:val="24"/>
         </w:rPr>
-        <w:t>users manual</w:t>
-      </w:r>
-      <w:proofErr w:type="spellEnd"/>
-      <w:r>
-        <w:rPr>
-          <w:rFonts w:ascii="Times New Roman" w:eastAsia="Times New Roman" w:hAnsi="Times New Roman" w:cs="Times New Roman"/>
-          <w:color w:val="000000"/>
-          <w:sz w:val="24"/>
-          <w:szCs w:val="24"/>
-        </w:rPr>
-        <w:t>, …)</w:t>
-      </w:r>
-    </w:p>
-    <w:p>
-      <w:pPr>
+      </w:pPr>
+    </w:p>
+    <w:p>
+      <w:pPr>
+        <w:pStyle w:val="Heading1"/>
+        <w:rPr>
+          <w:rFonts w:eastAsia="Times New Roman"/>
+        </w:rPr>
+      </w:pPr>
+      <w:r>
+        <w:rPr>
+          <w:rFonts w:eastAsia="Times New Roman"/>
+        </w:rPr>
+        <w:t>Future Issues or Problems</w:t>
+      </w:r>
+    </w:p>
+    <w:p>
+      <w:pPr>
+        <w:pStyle w:val="ListParagraph"/>
         <w:numPr>
           <w:ilvl w:val="0"/>
-          <w:numId w:val="1"/>
+          <w:numId w:val="7"/>
         </w:numPr>
-        <w:spacing w:before="100" w:beforeAutospacing="1" w:after="100" w:afterAutospacing="1" w:line="240" w:lineRule="auto"/>
-        <w:rPr>
-          <w:rFonts w:ascii="Times New Roman" w:eastAsia="Times New Roman" w:hAnsi="Times New Roman" w:cs="Times New Roman"/>
-          <w:color w:val="000000"/>
-          <w:sz w:val="27"/>
-          <w:szCs w:val="27"/>
-        </w:rPr>
-      </w:pPr>
-      <w:r>
-        <w:rPr>
-          <w:rFonts w:ascii="Times New Roman" w:eastAsia="Times New Roman" w:hAnsi="Times New Roman" w:cs="Times New Roman"/>
-          <w:color w:val="000000"/>
-          <w:sz w:val="24"/>
-          <w:szCs w:val="24"/>
-        </w:rPr>
-        <w:t>Outline the backlog</w:t>
-      </w:r>
-    </w:p>
-    <w:p>
-      <w:pPr>
-        <w:numPr>
-          <w:ilvl w:val="0"/>
-          <w:numId w:val="1"/>
-        </w:numPr>
-        <w:spacing w:before="100" w:beforeAutospacing="1" w:after="100" w:afterAutospacing="1" w:line="240" w:lineRule="auto"/>
-        <w:rPr>
-          <w:rFonts w:ascii="Times New Roman" w:eastAsia="Times New Roman" w:hAnsi="Times New Roman" w:cs="Times New Roman"/>
-          <w:color w:val="000000"/>
-          <w:sz w:val="27"/>
-          <w:szCs w:val="27"/>
-        </w:rPr>
-      </w:pPr>
-      <w:r>
-        <w:rPr>
-          <w:rFonts w:ascii="Times New Roman" w:eastAsia="Times New Roman" w:hAnsi="Times New Roman" w:cs="Times New Roman"/>
-          <w:color w:val="000000"/>
-          <w:sz w:val="24"/>
-          <w:szCs w:val="24"/>
-        </w:rPr>
-        <w:t>Identify any issues or problems you foresee.</w:t>
-      </w:r>
-    </w:p>
-    <w:p>
-      <w:pPr>
-        <w:numPr>
-          <w:ilvl w:val="0"/>
-          <w:numId w:val="1"/>
-        </w:numPr>
-        <w:spacing w:before="100" w:beforeAutospacing="1" w:after="100" w:afterAutospacing="1" w:line="240" w:lineRule="auto"/>
-        <w:rPr>
-          <w:rFonts w:ascii="Times New Roman" w:eastAsia="Times New Roman" w:hAnsi="Times New Roman" w:cs="Times New Roman"/>
-          <w:color w:val="000000"/>
-          <w:sz w:val="27"/>
-          <w:szCs w:val="27"/>
-        </w:rPr>
-      </w:pPr>
-      <w:r>
-        <w:rPr>
-          <w:rFonts w:ascii="Times New Roman" w:eastAsia="Times New Roman" w:hAnsi="Times New Roman" w:cs="Times New Roman"/>
-          <w:color w:val="000000"/>
-          <w:sz w:val="24"/>
-          <w:szCs w:val="24"/>
-        </w:rPr>
-        <w:t>Due as a separate document is the signed client contract.</w:t>
-      </w:r>
-    </w:p>
-    <w:p/>
+      </w:pPr>
+      <w:r>
+        <w:t>STB Runtime design using QtUILoader (can’t test until v9 is stable)</w:t>
+      </w:r>
+      <w:bookmarkStart w:id="0" w:name="_GoBack"/>
+      <w:bookmarkEnd w:id="0"/>
+    </w:p>
     <w:sectPr>
       <w:pgSz w:w="12240" w:h="15840"/>
       <w:pgMar w:top="1440" w:right="1440" w:bottom="1440" w:left="1440" w:header="720" w:footer="720" w:gutter="0"/>
@@ -471,6 +650,345 @@
 <file path=word/numbering.xml><?xml version="1.0" encoding="utf-8"?>
 <w:numbering xmlns:wpc="http://schemas.microsoft.com/office/word/2010/wordprocessingCanvas" xmlns:mc="http://schemas.openxmlformats.org/markup-compatibility/2006" xmlns:o="urn:schemas-microsoft-com:office:office" xmlns:r="http://schemas.openxmlformats.org/officeDocument/2006/relationships" xmlns:m="http://schemas.openxmlformats.org/officeDocument/2006/math" xmlns:v="urn:schemas-microsoft-com:vml" xmlns:wp14="http://schemas.microsoft.com/office/word/2010/wordprocessingDrawing" xmlns:wp="http://schemas.openxmlformats.org/drawingml/2006/wordprocessingDrawing" xmlns:w10="urn:schemas-microsoft-com:office:word" xmlns:w="http://schemas.openxmlformats.org/wordprocessingml/2006/main" xmlns:w14="http://schemas.microsoft.com/office/word/2010/wordml" xmlns:wpg="http://schemas.microsoft.com/office/word/2010/wordprocessingGroup" xmlns:wpi="http://schemas.microsoft.com/office/word/2010/wordprocessingInk" xmlns:wne="http://schemas.microsoft.com/office/word/2006/wordml" xmlns:wps="http://schemas.microsoft.com/office/word/2010/wordprocessingShape" mc:Ignorable="w14 wp14">
   <w:abstractNum w:abstractNumId="0">
+    <w:nsid w:val="0DE40DB9"/>
+    <w:multiLevelType w:val="hybridMultilevel"/>
+    <w:tmpl w:val="23083DDA"/>
+    <w:lvl w:ilvl="0" w:tplc="04090001">
+      <w:start w:val="1"/>
+      <w:numFmt w:val="bullet"/>
+      <w:lvlText w:val=""/>
+      <w:lvlJc w:val="left"/>
+      <w:pPr>
+        <w:ind w:left="720" w:hanging="360"/>
+      </w:pPr>
+      <w:rPr>
+        <w:rFonts w:ascii="Symbol" w:hAnsi="Symbol" w:hint="default"/>
+      </w:rPr>
+    </w:lvl>
+    <w:lvl w:ilvl="1" w:tplc="04090003" w:tentative="1">
+      <w:start w:val="1"/>
+      <w:numFmt w:val="bullet"/>
+      <w:lvlText w:val="o"/>
+      <w:lvlJc w:val="left"/>
+      <w:pPr>
+        <w:ind w:left="1440" w:hanging="360"/>
+      </w:pPr>
+      <w:rPr>
+        <w:rFonts w:ascii="Courier New" w:hAnsi="Courier New" w:cs="Courier New" w:hint="default"/>
+      </w:rPr>
+    </w:lvl>
+    <w:lvl w:ilvl="2" w:tplc="04090005" w:tentative="1">
+      <w:start w:val="1"/>
+      <w:numFmt w:val="bullet"/>
+      <w:lvlText w:val=""/>
+      <w:lvlJc w:val="left"/>
+      <w:pPr>
+        <w:ind w:left="2160" w:hanging="360"/>
+      </w:pPr>
+      <w:rPr>
+        <w:rFonts w:ascii="Wingdings" w:hAnsi="Wingdings" w:hint="default"/>
+      </w:rPr>
+    </w:lvl>
+    <w:lvl w:ilvl="3" w:tplc="04090001" w:tentative="1">
+      <w:start w:val="1"/>
+      <w:numFmt w:val="bullet"/>
+      <w:lvlText w:val=""/>
+      <w:lvlJc w:val="left"/>
+      <w:pPr>
+        <w:ind w:left="2880" w:hanging="360"/>
+      </w:pPr>
+      <w:rPr>
+        <w:rFonts w:ascii="Symbol" w:hAnsi="Symbol" w:hint="default"/>
+      </w:rPr>
+    </w:lvl>
+    <w:lvl w:ilvl="4" w:tplc="04090003" w:tentative="1">
+      <w:start w:val="1"/>
+      <w:numFmt w:val="bullet"/>
+      <w:lvlText w:val="o"/>
+      <w:lvlJc w:val="left"/>
+      <w:pPr>
+        <w:ind w:left="3600" w:hanging="360"/>
+      </w:pPr>
+      <w:rPr>
+        <w:rFonts w:ascii="Courier New" w:hAnsi="Courier New" w:cs="Courier New" w:hint="default"/>
+      </w:rPr>
+    </w:lvl>
+    <w:lvl w:ilvl="5" w:tplc="04090005" w:tentative="1">
+      <w:start w:val="1"/>
+      <w:numFmt w:val="bullet"/>
+      <w:lvlText w:val=""/>
+      <w:lvlJc w:val="left"/>
+      <w:pPr>
+        <w:ind w:left="4320" w:hanging="360"/>
+      </w:pPr>
+      <w:rPr>
+        <w:rFonts w:ascii="Wingdings" w:hAnsi="Wingdings" w:hint="default"/>
+      </w:rPr>
+    </w:lvl>
+    <w:lvl w:ilvl="6" w:tplc="04090001" w:tentative="1">
+      <w:start w:val="1"/>
+      <w:numFmt w:val="bullet"/>
+      <w:lvlText w:val=""/>
+      <w:lvlJc w:val="left"/>
+      <w:pPr>
+        <w:ind w:left="5040" w:hanging="360"/>
+      </w:pPr>
+      <w:rPr>
+        <w:rFonts w:ascii="Symbol" w:hAnsi="Symbol" w:hint="default"/>
+      </w:rPr>
+    </w:lvl>
+    <w:lvl w:ilvl="7" w:tplc="04090003" w:tentative="1">
+      <w:start w:val="1"/>
+      <w:numFmt w:val="bullet"/>
+      <w:lvlText w:val="o"/>
+      <w:lvlJc w:val="left"/>
+      <w:pPr>
+        <w:ind w:left="5760" w:hanging="360"/>
+      </w:pPr>
+      <w:rPr>
+        <w:rFonts w:ascii="Courier New" w:hAnsi="Courier New" w:cs="Courier New" w:hint="default"/>
+      </w:rPr>
+    </w:lvl>
+    <w:lvl w:ilvl="8" w:tplc="04090005" w:tentative="1">
+      <w:start w:val="1"/>
+      <w:numFmt w:val="bullet"/>
+      <w:lvlText w:val=""/>
+      <w:lvlJc w:val="left"/>
+      <w:pPr>
+        <w:ind w:left="6480" w:hanging="360"/>
+      </w:pPr>
+      <w:rPr>
+        <w:rFonts w:ascii="Wingdings" w:hAnsi="Wingdings" w:hint="default"/>
+      </w:rPr>
+    </w:lvl>
+  </w:abstractNum>
+  <w:abstractNum w:abstractNumId="1">
+    <w:nsid w:val="1C81385B"/>
+    <w:multiLevelType w:val="hybridMultilevel"/>
+    <w:tmpl w:val="4EBE3440"/>
+    <w:lvl w:ilvl="0" w:tplc="04090001">
+      <w:start w:val="1"/>
+      <w:numFmt w:val="bullet"/>
+      <w:lvlText w:val=""/>
+      <w:lvlJc w:val="left"/>
+      <w:pPr>
+        <w:ind w:left="720" w:hanging="360"/>
+      </w:pPr>
+      <w:rPr>
+        <w:rFonts w:ascii="Symbol" w:hAnsi="Symbol" w:hint="default"/>
+      </w:rPr>
+    </w:lvl>
+    <w:lvl w:ilvl="1" w:tplc="04090003">
+      <w:start w:val="1"/>
+      <w:numFmt w:val="bullet"/>
+      <w:lvlText w:val="o"/>
+      <w:lvlJc w:val="left"/>
+      <w:pPr>
+        <w:ind w:left="1440" w:hanging="360"/>
+      </w:pPr>
+      <w:rPr>
+        <w:rFonts w:ascii="Courier New" w:hAnsi="Courier New" w:cs="Courier New" w:hint="default"/>
+      </w:rPr>
+    </w:lvl>
+    <w:lvl w:ilvl="2" w:tplc="04090005">
+      <w:start w:val="1"/>
+      <w:numFmt w:val="bullet"/>
+      <w:lvlText w:val=""/>
+      <w:lvlJc w:val="left"/>
+      <w:pPr>
+        <w:ind w:left="2160" w:hanging="360"/>
+      </w:pPr>
+      <w:rPr>
+        <w:rFonts w:ascii="Wingdings" w:hAnsi="Wingdings" w:hint="default"/>
+      </w:rPr>
+    </w:lvl>
+    <w:lvl w:ilvl="3" w:tplc="04090001" w:tentative="1">
+      <w:start w:val="1"/>
+      <w:numFmt w:val="bullet"/>
+      <w:lvlText w:val=""/>
+      <w:lvlJc w:val="left"/>
+      <w:pPr>
+        <w:ind w:left="2880" w:hanging="360"/>
+      </w:pPr>
+      <w:rPr>
+        <w:rFonts w:ascii="Symbol" w:hAnsi="Symbol" w:hint="default"/>
+      </w:rPr>
+    </w:lvl>
+    <w:lvl w:ilvl="4" w:tplc="04090003" w:tentative="1">
+      <w:start w:val="1"/>
+      <w:numFmt w:val="bullet"/>
+      <w:lvlText w:val="o"/>
+      <w:lvlJc w:val="left"/>
+      <w:pPr>
+        <w:ind w:left="3600" w:hanging="360"/>
+      </w:pPr>
+      <w:rPr>
+        <w:rFonts w:ascii="Courier New" w:hAnsi="Courier New" w:cs="Courier New" w:hint="default"/>
+      </w:rPr>
+    </w:lvl>
+    <w:lvl w:ilvl="5" w:tplc="04090005" w:tentative="1">
+      <w:start w:val="1"/>
+      <w:numFmt w:val="bullet"/>
+      <w:lvlText w:val=""/>
+      <w:lvlJc w:val="left"/>
+      <w:pPr>
+        <w:ind w:left="4320" w:hanging="360"/>
+      </w:pPr>
+      <w:rPr>
+        <w:rFonts w:ascii="Wingdings" w:hAnsi="Wingdings" w:hint="default"/>
+      </w:rPr>
+    </w:lvl>
+    <w:lvl w:ilvl="6" w:tplc="04090001" w:tentative="1">
+      <w:start w:val="1"/>
+      <w:numFmt w:val="bullet"/>
+      <w:lvlText w:val=""/>
+      <w:lvlJc w:val="left"/>
+      <w:pPr>
+        <w:ind w:left="5040" w:hanging="360"/>
+      </w:pPr>
+      <w:rPr>
+        <w:rFonts w:ascii="Symbol" w:hAnsi="Symbol" w:hint="default"/>
+      </w:rPr>
+    </w:lvl>
+    <w:lvl w:ilvl="7" w:tplc="04090003" w:tentative="1">
+      <w:start w:val="1"/>
+      <w:numFmt w:val="bullet"/>
+      <w:lvlText w:val="o"/>
+      <w:lvlJc w:val="left"/>
+      <w:pPr>
+        <w:ind w:left="5760" w:hanging="360"/>
+      </w:pPr>
+      <w:rPr>
+        <w:rFonts w:ascii="Courier New" w:hAnsi="Courier New" w:cs="Courier New" w:hint="default"/>
+      </w:rPr>
+    </w:lvl>
+    <w:lvl w:ilvl="8" w:tplc="04090005" w:tentative="1">
+      <w:start w:val="1"/>
+      <w:numFmt w:val="bullet"/>
+      <w:lvlText w:val=""/>
+      <w:lvlJc w:val="left"/>
+      <w:pPr>
+        <w:ind w:left="6480" w:hanging="360"/>
+      </w:pPr>
+      <w:rPr>
+        <w:rFonts w:ascii="Wingdings" w:hAnsi="Wingdings" w:hint="default"/>
+      </w:rPr>
+    </w:lvl>
+  </w:abstractNum>
+  <w:abstractNum w:abstractNumId="2">
+    <w:nsid w:val="312D557F"/>
+    <w:multiLevelType w:val="hybridMultilevel"/>
+    <w:tmpl w:val="661CBD84"/>
+    <w:lvl w:ilvl="0" w:tplc="04090001">
+      <w:start w:val="1"/>
+      <w:numFmt w:val="bullet"/>
+      <w:lvlText w:val=""/>
+      <w:lvlJc w:val="left"/>
+      <w:pPr>
+        <w:ind w:left="720" w:hanging="360"/>
+      </w:pPr>
+      <w:rPr>
+        <w:rFonts w:ascii="Symbol" w:hAnsi="Symbol" w:hint="default"/>
+      </w:rPr>
+    </w:lvl>
+    <w:lvl w:ilvl="1" w:tplc="04090003" w:tentative="1">
+      <w:start w:val="1"/>
+      <w:numFmt w:val="bullet"/>
+      <w:lvlText w:val="o"/>
+      <w:lvlJc w:val="left"/>
+      <w:pPr>
+        <w:ind w:left="1440" w:hanging="360"/>
+      </w:pPr>
+      <w:rPr>
+        <w:rFonts w:ascii="Courier New" w:hAnsi="Courier New" w:cs="Courier New" w:hint="default"/>
+      </w:rPr>
+    </w:lvl>
+    <w:lvl w:ilvl="2" w:tplc="04090005" w:tentative="1">
+      <w:start w:val="1"/>
+      <w:numFmt w:val="bullet"/>
+      <w:lvlText w:val=""/>
+      <w:lvlJc w:val="left"/>
+      <w:pPr>
+        <w:ind w:left="2160" w:hanging="360"/>
+      </w:pPr>
+      <w:rPr>
+        <w:rFonts w:ascii="Wingdings" w:hAnsi="Wingdings" w:hint="default"/>
+      </w:rPr>
+    </w:lvl>
+    <w:lvl w:ilvl="3" w:tplc="04090001" w:tentative="1">
+      <w:start w:val="1"/>
+      <w:numFmt w:val="bullet"/>
+      <w:lvlText w:val=""/>
+      <w:lvlJc w:val="left"/>
+      <w:pPr>
+        <w:ind w:left="2880" w:hanging="360"/>
+      </w:pPr>
+      <w:rPr>
+        <w:rFonts w:ascii="Symbol" w:hAnsi="Symbol" w:hint="default"/>
+      </w:rPr>
+    </w:lvl>
+    <w:lvl w:ilvl="4" w:tplc="04090003" w:tentative="1">
+      <w:start w:val="1"/>
+      <w:numFmt w:val="bullet"/>
+      <w:lvlText w:val="o"/>
+      <w:lvlJc w:val="left"/>
+      <w:pPr>
+        <w:ind w:left="3600" w:hanging="360"/>
+      </w:pPr>
+      <w:rPr>
+        <w:rFonts w:ascii="Courier New" w:hAnsi="Courier New" w:cs="Courier New" w:hint="default"/>
+      </w:rPr>
+    </w:lvl>
+    <w:lvl w:ilvl="5" w:tplc="04090005" w:tentative="1">
+      <w:start w:val="1"/>
+      <w:numFmt w:val="bullet"/>
+      <w:lvlText w:val=""/>
+      <w:lvlJc w:val="left"/>
+      <w:pPr>
+        <w:ind w:left="4320" w:hanging="360"/>
+      </w:pPr>
+      <w:rPr>
+        <w:rFonts w:ascii="Wingdings" w:hAnsi="Wingdings" w:hint="default"/>
+      </w:rPr>
+    </w:lvl>
+    <w:lvl w:ilvl="6" w:tplc="04090001" w:tentative="1">
+      <w:start w:val="1"/>
+      <w:numFmt w:val="bullet"/>
+      <w:lvlText w:val=""/>
+      <w:lvlJc w:val="left"/>
+      <w:pPr>
+        <w:ind w:left="5040" w:hanging="360"/>
+      </w:pPr>
+      <w:rPr>
+        <w:rFonts w:ascii="Symbol" w:hAnsi="Symbol" w:hint="default"/>
+      </w:rPr>
+    </w:lvl>
+    <w:lvl w:ilvl="7" w:tplc="04090003" w:tentative="1">
+      <w:start w:val="1"/>
+      <w:numFmt w:val="bullet"/>
+      <w:lvlText w:val="o"/>
+      <w:lvlJc w:val="left"/>
+      <w:pPr>
+        <w:ind w:left="5760" w:hanging="360"/>
+      </w:pPr>
+      <w:rPr>
+        <w:rFonts w:ascii="Courier New" w:hAnsi="Courier New" w:cs="Courier New" w:hint="default"/>
+      </w:rPr>
+    </w:lvl>
+    <w:lvl w:ilvl="8" w:tplc="04090005" w:tentative="1">
+      <w:start w:val="1"/>
+      <w:numFmt w:val="bullet"/>
+      <w:lvlText w:val=""/>
+      <w:lvlJc w:val="left"/>
+      <w:pPr>
+        <w:ind w:left="6480" w:hanging="360"/>
+      </w:pPr>
+      <w:rPr>
+        <w:rFonts w:ascii="Wingdings" w:hAnsi="Wingdings" w:hint="default"/>
+      </w:rPr>
+    </w:lvl>
+  </w:abstractNum>
+  <w:abstractNum w:abstractNumId="3">
     <w:nsid w:val="364E092B"/>
     <w:multiLevelType w:val="multilevel"/>
     <w:tmpl w:val="AED6E9BA"/>
@@ -619,7 +1137,233 @@
       </w:rPr>
     </w:lvl>
   </w:abstractNum>
-  <w:abstractNum w:abstractNumId="1">
+  <w:abstractNum w:abstractNumId="4">
+    <w:nsid w:val="561C2D5B"/>
+    <w:multiLevelType w:val="hybridMultilevel"/>
+    <w:tmpl w:val="69CAC8CE"/>
+    <w:lvl w:ilvl="0" w:tplc="04090001">
+      <w:start w:val="1"/>
+      <w:numFmt w:val="bullet"/>
+      <w:lvlText w:val=""/>
+      <w:lvlJc w:val="left"/>
+      <w:pPr>
+        <w:ind w:left="720" w:hanging="360"/>
+      </w:pPr>
+      <w:rPr>
+        <w:rFonts w:ascii="Symbol" w:hAnsi="Symbol" w:hint="default"/>
+      </w:rPr>
+    </w:lvl>
+    <w:lvl w:ilvl="1" w:tplc="04090003" w:tentative="1">
+      <w:start w:val="1"/>
+      <w:numFmt w:val="bullet"/>
+      <w:lvlText w:val="o"/>
+      <w:lvlJc w:val="left"/>
+      <w:pPr>
+        <w:ind w:left="1440" w:hanging="360"/>
+      </w:pPr>
+      <w:rPr>
+        <w:rFonts w:ascii="Courier New" w:hAnsi="Courier New" w:cs="Courier New" w:hint="default"/>
+      </w:rPr>
+    </w:lvl>
+    <w:lvl w:ilvl="2" w:tplc="04090005" w:tentative="1">
+      <w:start w:val="1"/>
+      <w:numFmt w:val="bullet"/>
+      <w:lvlText w:val=""/>
+      <w:lvlJc w:val="left"/>
+      <w:pPr>
+        <w:ind w:left="2160" w:hanging="360"/>
+      </w:pPr>
+      <w:rPr>
+        <w:rFonts w:ascii="Wingdings" w:hAnsi="Wingdings" w:hint="default"/>
+      </w:rPr>
+    </w:lvl>
+    <w:lvl w:ilvl="3" w:tplc="04090001" w:tentative="1">
+      <w:start w:val="1"/>
+      <w:numFmt w:val="bullet"/>
+      <w:lvlText w:val=""/>
+      <w:lvlJc w:val="left"/>
+      <w:pPr>
+        <w:ind w:left="2880" w:hanging="360"/>
+      </w:pPr>
+      <w:rPr>
+        <w:rFonts w:ascii="Symbol" w:hAnsi="Symbol" w:hint="default"/>
+      </w:rPr>
+    </w:lvl>
+    <w:lvl w:ilvl="4" w:tplc="04090003" w:tentative="1">
+      <w:start w:val="1"/>
+      <w:numFmt w:val="bullet"/>
+      <w:lvlText w:val="o"/>
+      <w:lvlJc w:val="left"/>
+      <w:pPr>
+        <w:ind w:left="3600" w:hanging="360"/>
+      </w:pPr>
+      <w:rPr>
+        <w:rFonts w:ascii="Courier New" w:hAnsi="Courier New" w:cs="Courier New" w:hint="default"/>
+      </w:rPr>
+    </w:lvl>
+    <w:lvl w:ilvl="5" w:tplc="04090005" w:tentative="1">
+      <w:start w:val="1"/>
+      <w:numFmt w:val="bullet"/>
+      <w:lvlText w:val=""/>
+      <w:lvlJc w:val="left"/>
+      <w:pPr>
+        <w:ind w:left="4320" w:hanging="360"/>
+      </w:pPr>
+      <w:rPr>
+        <w:rFonts w:ascii="Wingdings" w:hAnsi="Wingdings" w:hint="default"/>
+      </w:rPr>
+    </w:lvl>
+    <w:lvl w:ilvl="6" w:tplc="04090001" w:tentative="1">
+      <w:start w:val="1"/>
+      <w:numFmt w:val="bullet"/>
+      <w:lvlText w:val=""/>
+      <w:lvlJc w:val="left"/>
+      <w:pPr>
+        <w:ind w:left="5040" w:hanging="360"/>
+      </w:pPr>
+      <w:rPr>
+        <w:rFonts w:ascii="Symbol" w:hAnsi="Symbol" w:hint="default"/>
+      </w:rPr>
+    </w:lvl>
+    <w:lvl w:ilvl="7" w:tplc="04090003" w:tentative="1">
+      <w:start w:val="1"/>
+      <w:numFmt w:val="bullet"/>
+      <w:lvlText w:val="o"/>
+      <w:lvlJc w:val="left"/>
+      <w:pPr>
+        <w:ind w:left="5760" w:hanging="360"/>
+      </w:pPr>
+      <w:rPr>
+        <w:rFonts w:ascii="Courier New" w:hAnsi="Courier New" w:cs="Courier New" w:hint="default"/>
+      </w:rPr>
+    </w:lvl>
+    <w:lvl w:ilvl="8" w:tplc="04090005" w:tentative="1">
+      <w:start w:val="1"/>
+      <w:numFmt w:val="bullet"/>
+      <w:lvlText w:val=""/>
+      <w:lvlJc w:val="left"/>
+      <w:pPr>
+        <w:ind w:left="6480" w:hanging="360"/>
+      </w:pPr>
+      <w:rPr>
+        <w:rFonts w:ascii="Wingdings" w:hAnsi="Wingdings" w:hint="default"/>
+      </w:rPr>
+    </w:lvl>
+  </w:abstractNum>
+  <w:abstractNum w:abstractNumId="5">
+    <w:nsid w:val="5FA80BCA"/>
+    <w:multiLevelType w:val="hybridMultilevel"/>
+    <w:tmpl w:val="C84A44A6"/>
+    <w:lvl w:ilvl="0" w:tplc="04090001">
+      <w:start w:val="1"/>
+      <w:numFmt w:val="bullet"/>
+      <w:lvlText w:val=""/>
+      <w:lvlJc w:val="left"/>
+      <w:pPr>
+        <w:ind w:left="720" w:hanging="360"/>
+      </w:pPr>
+      <w:rPr>
+        <w:rFonts w:ascii="Symbol" w:hAnsi="Symbol" w:hint="default"/>
+      </w:rPr>
+    </w:lvl>
+    <w:lvl w:ilvl="1" w:tplc="04090003" w:tentative="1">
+      <w:start w:val="1"/>
+      <w:numFmt w:val="bullet"/>
+      <w:lvlText w:val="o"/>
+      <w:lvlJc w:val="left"/>
+      <w:pPr>
+        <w:ind w:left="1440" w:hanging="360"/>
+      </w:pPr>
+      <w:rPr>
+        <w:rFonts w:ascii="Courier New" w:hAnsi="Courier New" w:cs="Courier New" w:hint="default"/>
+      </w:rPr>
+    </w:lvl>
+    <w:lvl w:ilvl="2" w:tplc="04090005" w:tentative="1">
+      <w:start w:val="1"/>
+      <w:numFmt w:val="bullet"/>
+      <w:lvlText w:val=""/>
+      <w:lvlJc w:val="left"/>
+      <w:pPr>
+        <w:ind w:left="2160" w:hanging="360"/>
+      </w:pPr>
+      <w:rPr>
+        <w:rFonts w:ascii="Wingdings" w:hAnsi="Wingdings" w:hint="default"/>
+      </w:rPr>
+    </w:lvl>
+    <w:lvl w:ilvl="3" w:tplc="04090001" w:tentative="1">
+      <w:start w:val="1"/>
+      <w:numFmt w:val="bullet"/>
+      <w:lvlText w:val=""/>
+      <w:lvlJc w:val="left"/>
+      <w:pPr>
+        <w:ind w:left="2880" w:hanging="360"/>
+      </w:pPr>
+      <w:rPr>
+        <w:rFonts w:ascii="Symbol" w:hAnsi="Symbol" w:hint="default"/>
+      </w:rPr>
+    </w:lvl>
+    <w:lvl w:ilvl="4" w:tplc="04090003" w:tentative="1">
+      <w:start w:val="1"/>
+      <w:numFmt w:val="bullet"/>
+      <w:lvlText w:val="o"/>
+      <w:lvlJc w:val="left"/>
+      <w:pPr>
+        <w:ind w:left="3600" w:hanging="360"/>
+      </w:pPr>
+      <w:rPr>
+        <w:rFonts w:ascii="Courier New" w:hAnsi="Courier New" w:cs="Courier New" w:hint="default"/>
+      </w:rPr>
+    </w:lvl>
+    <w:lvl w:ilvl="5" w:tplc="04090005" w:tentative="1">
+      <w:start w:val="1"/>
+      <w:numFmt w:val="bullet"/>
+      <w:lvlText w:val=""/>
+      <w:lvlJc w:val="left"/>
+      <w:pPr>
+        <w:ind w:left="4320" w:hanging="360"/>
+      </w:pPr>
+      <w:rPr>
+        <w:rFonts w:ascii="Wingdings" w:hAnsi="Wingdings" w:hint="default"/>
+      </w:rPr>
+    </w:lvl>
+    <w:lvl w:ilvl="6" w:tplc="04090001" w:tentative="1">
+      <w:start w:val="1"/>
+      <w:numFmt w:val="bullet"/>
+      <w:lvlText w:val=""/>
+      <w:lvlJc w:val="left"/>
+      <w:pPr>
+        <w:ind w:left="5040" w:hanging="360"/>
+      </w:pPr>
+      <w:rPr>
+        <w:rFonts w:ascii="Symbol" w:hAnsi="Symbol" w:hint="default"/>
+      </w:rPr>
+    </w:lvl>
+    <w:lvl w:ilvl="7" w:tplc="04090003" w:tentative="1">
+      <w:start w:val="1"/>
+      <w:numFmt w:val="bullet"/>
+      <w:lvlText w:val="o"/>
+      <w:lvlJc w:val="left"/>
+      <w:pPr>
+        <w:ind w:left="5760" w:hanging="360"/>
+      </w:pPr>
+      <w:rPr>
+        <w:rFonts w:ascii="Courier New" w:hAnsi="Courier New" w:cs="Courier New" w:hint="default"/>
+      </w:rPr>
+    </w:lvl>
+    <w:lvl w:ilvl="8" w:tplc="04090005" w:tentative="1">
+      <w:start w:val="1"/>
+      <w:numFmt w:val="bullet"/>
+      <w:lvlText w:val=""/>
+      <w:lvlJc w:val="left"/>
+      <w:pPr>
+        <w:ind w:left="6480" w:hanging="360"/>
+      </w:pPr>
+      <w:rPr>
+        <w:rFonts w:ascii="Wingdings" w:hAnsi="Wingdings" w:hint="default"/>
+      </w:rPr>
+    </w:lvl>
+  </w:abstractNum>
+  <w:abstractNum w:abstractNumId="6">
     <w:nsid w:val="7DD35565"/>
     <w:multiLevelType w:val="hybridMultilevel"/>
     <w:tmpl w:val="936AF78C"/>
@@ -733,10 +1477,25 @@
     </w:lvl>
   </w:abstractNum>
   <w:num w:numId="1">
+    <w:abstractNumId w:val="3"/>
+  </w:num>
+  <w:num w:numId="2">
+    <w:abstractNumId w:val="6"/>
+  </w:num>
+  <w:num w:numId="3">
+    <w:abstractNumId w:val="1"/>
+  </w:num>
+  <w:num w:numId="4">
+    <w:abstractNumId w:val="2"/>
+  </w:num>
+  <w:num w:numId="5">
     <w:abstractNumId w:val="0"/>
   </w:num>
-  <w:num w:numId="2">
-    <w:abstractNumId w:val="1"/>
+  <w:num w:numId="6">
+    <w:abstractNumId w:val="5"/>
+  </w:num>
+  <w:num w:numId="7">
+    <w:abstractNumId w:val="4"/>
   </w:num>
 </w:numbering>
 </file>
@@ -924,6 +1683,52 @@
       <w:szCs w:val="28"/>
     </w:rPr>
   </w:style>
+  <w:style w:type="paragraph" w:styleId="Heading2">
+    <w:name w:val="heading 2"/>
+    <w:basedOn w:val="Normal"/>
+    <w:next w:val="Normal"/>
+    <w:link w:val="Heading2Char"/>
+    <w:uiPriority w:val="9"/>
+    <w:unhideWhenUsed/>
+    <w:qFormat/>
+    <w:rsid w:val="00A61C33"/>
+    <w:pPr>
+      <w:keepNext/>
+      <w:keepLines/>
+      <w:spacing w:before="200" w:after="0"/>
+      <w:outlineLvl w:val="1"/>
+    </w:pPr>
+    <w:rPr>
+      <w:rFonts w:asciiTheme="majorHAnsi" w:eastAsiaTheme="majorEastAsia" w:hAnsiTheme="majorHAnsi" w:cstheme="majorBidi"/>
+      <w:b/>
+      <w:bCs/>
+      <w:color w:val="4F81BD" w:themeColor="accent1"/>
+      <w:sz w:val="26"/>
+      <w:szCs w:val="26"/>
+    </w:rPr>
+  </w:style>
+  <w:style w:type="paragraph" w:styleId="Heading3">
+    <w:name w:val="heading 3"/>
+    <w:basedOn w:val="Normal"/>
+    <w:next w:val="Normal"/>
+    <w:link w:val="Heading3Char"/>
+    <w:uiPriority w:val="9"/>
+    <w:unhideWhenUsed/>
+    <w:qFormat/>
+    <w:rsid w:val="00A61C33"/>
+    <w:pPr>
+      <w:keepNext/>
+      <w:keepLines/>
+      <w:spacing w:before="200" w:after="0"/>
+      <w:outlineLvl w:val="2"/>
+    </w:pPr>
+    <w:rPr>
+      <w:rFonts w:asciiTheme="majorHAnsi" w:eastAsiaTheme="majorEastAsia" w:hAnsiTheme="majorHAnsi" w:cstheme="majorBidi"/>
+      <w:b/>
+      <w:bCs/>
+      <w:color w:val="4F81BD" w:themeColor="accent1"/>
+    </w:rPr>
+  </w:style>
   <w:style w:type="character" w:default="1" w:styleId="DefaultParagraphFont">
     <w:name w:val="Default Paragraph Font"/>
     <w:uiPriority w:val="1"/>
@@ -1015,6 +1820,34 @@
       <w:ind w:left="720"/>
       <w:contextualSpacing/>
     </w:pPr>
+  </w:style>
+  <w:style w:type="character" w:customStyle="1" w:styleId="Heading2Char">
+    <w:name w:val="Heading 2 Char"/>
+    <w:basedOn w:val="DefaultParagraphFont"/>
+    <w:link w:val="Heading2"/>
+    <w:uiPriority w:val="9"/>
+    <w:rsid w:val="00A61C33"/>
+    <w:rPr>
+      <w:rFonts w:asciiTheme="majorHAnsi" w:eastAsiaTheme="majorEastAsia" w:hAnsiTheme="majorHAnsi" w:cstheme="majorBidi"/>
+      <w:b/>
+      <w:bCs/>
+      <w:color w:val="4F81BD" w:themeColor="accent1"/>
+      <w:sz w:val="26"/>
+      <w:szCs w:val="26"/>
+    </w:rPr>
+  </w:style>
+  <w:style w:type="character" w:customStyle="1" w:styleId="Heading3Char">
+    <w:name w:val="Heading 3 Char"/>
+    <w:basedOn w:val="DefaultParagraphFont"/>
+    <w:link w:val="Heading3"/>
+    <w:uiPriority w:val="9"/>
+    <w:rsid w:val="00A61C33"/>
+    <w:rPr>
+      <w:rFonts w:asciiTheme="majorHAnsi" w:eastAsiaTheme="majorEastAsia" w:hAnsiTheme="majorHAnsi" w:cstheme="majorBidi"/>
+      <w:b/>
+      <w:bCs/>
+      <w:color w:val="4F81BD" w:themeColor="accent1"/>
+    </w:rPr>
   </w:style>
 </w:styles>
 </file>
@@ -1202,6 +2035,52 @@
       <w:szCs w:val="28"/>
     </w:rPr>
   </w:style>
+  <w:style w:type="paragraph" w:styleId="Heading2">
+    <w:name w:val="heading 2"/>
+    <w:basedOn w:val="Normal"/>
+    <w:next w:val="Normal"/>
+    <w:link w:val="Heading2Char"/>
+    <w:uiPriority w:val="9"/>
+    <w:unhideWhenUsed/>
+    <w:qFormat/>
+    <w:rsid w:val="00A61C33"/>
+    <w:pPr>
+      <w:keepNext/>
+      <w:keepLines/>
+      <w:spacing w:before="200" w:after="0"/>
+      <w:outlineLvl w:val="1"/>
+    </w:pPr>
+    <w:rPr>
+      <w:rFonts w:asciiTheme="majorHAnsi" w:eastAsiaTheme="majorEastAsia" w:hAnsiTheme="majorHAnsi" w:cstheme="majorBidi"/>
+      <w:b/>
+      <w:bCs/>
+      <w:color w:val="4F81BD" w:themeColor="accent1"/>
+      <w:sz w:val="26"/>
+      <w:szCs w:val="26"/>
+    </w:rPr>
+  </w:style>
+  <w:style w:type="paragraph" w:styleId="Heading3">
+    <w:name w:val="heading 3"/>
+    <w:basedOn w:val="Normal"/>
+    <w:next w:val="Normal"/>
+    <w:link w:val="Heading3Char"/>
+    <w:uiPriority w:val="9"/>
+    <w:unhideWhenUsed/>
+    <w:qFormat/>
+    <w:rsid w:val="00A61C33"/>
+    <w:pPr>
+      <w:keepNext/>
+      <w:keepLines/>
+      <w:spacing w:before="200" w:after="0"/>
+      <w:outlineLvl w:val="2"/>
+    </w:pPr>
+    <w:rPr>
+      <w:rFonts w:asciiTheme="majorHAnsi" w:eastAsiaTheme="majorEastAsia" w:hAnsiTheme="majorHAnsi" w:cstheme="majorBidi"/>
+      <w:b/>
+      <w:bCs/>
+      <w:color w:val="4F81BD" w:themeColor="accent1"/>
+    </w:rPr>
+  </w:style>
   <w:style w:type="character" w:default="1" w:styleId="DefaultParagraphFont">
     <w:name w:val="Default Paragraph Font"/>
     <w:uiPriority w:val="1"/>
@@ -1293,6 +2172,34 @@
       <w:ind w:left="720"/>
       <w:contextualSpacing/>
     </w:pPr>
+  </w:style>
+  <w:style w:type="character" w:customStyle="1" w:styleId="Heading2Char">
+    <w:name w:val="Heading 2 Char"/>
+    <w:basedOn w:val="DefaultParagraphFont"/>
+    <w:link w:val="Heading2"/>
+    <w:uiPriority w:val="9"/>
+    <w:rsid w:val="00A61C33"/>
+    <w:rPr>
+      <w:rFonts w:asciiTheme="majorHAnsi" w:eastAsiaTheme="majorEastAsia" w:hAnsiTheme="majorHAnsi" w:cstheme="majorBidi"/>
+      <w:b/>
+      <w:bCs/>
+      <w:color w:val="4F81BD" w:themeColor="accent1"/>
+      <w:sz w:val="26"/>
+      <w:szCs w:val="26"/>
+    </w:rPr>
+  </w:style>
+  <w:style w:type="character" w:customStyle="1" w:styleId="Heading3Char">
+    <w:name w:val="Heading 3 Char"/>
+    <w:basedOn w:val="DefaultParagraphFont"/>
+    <w:link w:val="Heading3"/>
+    <w:uiPriority w:val="9"/>
+    <w:rsid w:val="00A61C33"/>
+    <w:rPr>
+      <w:rFonts w:asciiTheme="majorHAnsi" w:eastAsiaTheme="majorEastAsia" w:hAnsiTheme="majorHAnsi" w:cstheme="majorBidi"/>
+      <w:b/>
+      <w:bCs/>
+      <w:color w:val="4F81BD" w:themeColor="accent1"/>
+    </w:rPr>
   </w:style>
 </w:styles>
 </file>

</xml_diff>

<commit_message>
Added current system info to SprintReport1
</commit_message>
<xml_diff>
--- a/srDesign_SprintReport1.docx
+++ b/srDesign_SprintReport1.docx
@@ -88,7 +88,15 @@
     </w:p>
     <w:p>
       <w:r>
-        <w:t xml:space="preserve">Innovative Systems </w:t>
+        <w:t>Innovative System</w:t>
+      </w:r>
+      <w:bookmarkStart w:id="0" w:name="_GoBack"/>
+      <w:bookmarkEnd w:id="0"/>
+      <w:r>
+        <w:t xml:space="preserve">s </w:t>
+      </w:r>
+      <w:r>
+        <w:t>L.L.C.</w:t>
       </w:r>
     </w:p>
     <w:p>
@@ -497,6 +505,171 @@
     </w:p>
     <w:p>
       <w:pPr>
+        <w:pStyle w:val="ListParagraph"/>
+        <w:numPr>
+          <w:ilvl w:val="0"/>
+          <w:numId w:val="10"/>
+        </w:numPr>
+        <w:ind w:left="720"/>
+      </w:pPr>
+      <w:r>
+        <w:t xml:space="preserve">The games will run on Amino Set Top Boxes. These STBs run a custom build of QT, </w:t>
+      </w:r>
+      <w:proofErr w:type="spellStart"/>
+      <w:r>
+        <w:t>binded</w:t>
+      </w:r>
+      <w:proofErr w:type="spellEnd"/>
+      <w:r>
+        <w:t xml:space="preserve"> to C++. The game server software will be written in C# and must be able to run under .NET 4.5. The server should be able to operate in a Windows or Azure operating system. </w:t>
+      </w:r>
+    </w:p>
+    <w:p>
+      <w:pPr>
+        <w:pStyle w:val="ListParagraph"/>
+        <w:numPr>
+          <w:ilvl w:val="0"/>
+          <w:numId w:val="10"/>
+        </w:numPr>
+        <w:ind w:left="720"/>
+      </w:pPr>
+      <w:r>
+        <w:t>The multi-player game environment will consist of:</w:t>
+      </w:r>
+    </w:p>
+    <w:p>
+      <w:pPr>
+        <w:pStyle w:val="ListParagraph"/>
+        <w:numPr>
+          <w:ilvl w:val="0"/>
+          <w:numId w:val="9"/>
+        </w:numPr>
+        <w:ind w:left="720"/>
+        <w:rPr>
+          <w:vanish/>
+        </w:rPr>
+      </w:pPr>
+    </w:p>
+    <w:p>
+      <w:pPr>
+        <w:pStyle w:val="ListParagraph"/>
+        <w:numPr>
+          <w:ilvl w:val="0"/>
+          <w:numId w:val="9"/>
+        </w:numPr>
+        <w:ind w:left="720"/>
+        <w:rPr>
+          <w:vanish/>
+        </w:rPr>
+      </w:pPr>
+    </w:p>
+    <w:p>
+      <w:pPr>
+        <w:pStyle w:val="ListParagraph"/>
+        <w:numPr>
+          <w:ilvl w:val="0"/>
+          <w:numId w:val="9"/>
+        </w:numPr>
+        <w:ind w:left="720"/>
+        <w:rPr>
+          <w:vanish/>
+        </w:rPr>
+      </w:pPr>
+    </w:p>
+    <w:p>
+      <w:pPr>
+        <w:pStyle w:val="ListParagraph"/>
+        <w:numPr>
+          <w:ilvl w:val="1"/>
+          <w:numId w:val="9"/>
+        </w:numPr>
+        <w:ind w:left="720"/>
+        <w:rPr>
+          <w:vanish/>
+        </w:rPr>
+      </w:pPr>
+    </w:p>
+    <w:p>
+      <w:pPr>
+        <w:pStyle w:val="ListParagraph"/>
+        <w:numPr>
+          <w:ilvl w:val="1"/>
+          <w:numId w:val="9"/>
+        </w:numPr>
+        <w:ind w:left="720"/>
+        <w:rPr>
+          <w:vanish/>
+        </w:rPr>
+      </w:pPr>
+    </w:p>
+    <w:p>
+      <w:pPr>
+        <w:pStyle w:val="ListParagraph"/>
+        <w:numPr>
+          <w:ilvl w:val="1"/>
+          <w:numId w:val="10"/>
+        </w:numPr>
+        <w:ind w:left="1260"/>
+      </w:pPr>
+      <w:r>
+        <w:t>One or more APMax</w:t>
+      </w:r>
+      <w:r>
+        <w:t xml:space="preserve"> </w:t>
+      </w:r>
+      <w:r>
+        <w:t>units</w:t>
+      </w:r>
+    </w:p>
+    <w:p>
+      <w:pPr>
+        <w:pStyle w:val="ListParagraph"/>
+        <w:numPr>
+          <w:ilvl w:val="1"/>
+          <w:numId w:val="10"/>
+        </w:numPr>
+        <w:ind w:left="1260"/>
+      </w:pPr>
+      <w:r>
+        <w:t>Amino Set Top Boxes</w:t>
+      </w:r>
+    </w:p>
+    <w:p>
+      <w:pPr>
+        <w:pStyle w:val="ListParagraph"/>
+        <w:numPr>
+          <w:ilvl w:val="1"/>
+          <w:numId w:val="10"/>
+        </w:numPr>
+        <w:ind w:left="1260"/>
+      </w:pPr>
+      <w:r>
+        <w:t>One game server</w:t>
+      </w:r>
+    </w:p>
+    <w:p>
+      <w:pPr>
+        <w:pStyle w:val="ListParagraph"/>
+        <w:numPr>
+          <w:ilvl w:val="1"/>
+          <w:numId w:val="10"/>
+        </w:numPr>
+        <w:ind w:left="1260"/>
+      </w:pPr>
+      <w:r>
+        <w:t>One or more individual servers dedicated to A.I. processing</w:t>
+      </w:r>
+    </w:p>
+    <w:p>
+      <w:r>
+        <w:t>The multi-player game environment will be spread cross country and distributed over many systems already in place. The environment follows the client-server model with an added element in the middle, the APMax, known as middleware</w:t>
+      </w:r>
+      <w:r>
+        <w:t>.</w:t>
+      </w:r>
+    </w:p>
+    <w:p>
+      <w:pPr>
         <w:spacing w:before="100" w:beforeAutospacing="1" w:after="100" w:afterAutospacing="1" w:line="240" w:lineRule="auto"/>
         <w:rPr>
           <w:rFonts w:ascii="Times New Roman" w:eastAsia="Times New Roman" w:hAnsi="Times New Roman" w:cs="Times New Roman"/>
@@ -632,10 +805,16 @@
         </w:numPr>
       </w:pPr>
       <w:r>
-        <w:t>STB Runtime design using QtUILoader (can’t test until v9 is stable)</w:t>
-      </w:r>
-      <w:bookmarkStart w:id="0" w:name="_GoBack"/>
-      <w:bookmarkEnd w:id="0"/>
+        <w:t xml:space="preserve">STB Runtime design using </w:t>
+      </w:r>
+      <w:proofErr w:type="spellStart"/>
+      <w:r>
+        <w:t>QtUILoader</w:t>
+      </w:r>
+      <w:proofErr w:type="spellEnd"/>
+      <w:r>
+        <w:t xml:space="preserve"> (can’t test until v9 is stable)</w:t>
+      </w:r>
     </w:p>
     <w:sectPr>
       <w:pgSz w:w="12240" w:h="15840"/>
@@ -763,6 +942,92 @@
     </w:lvl>
   </w:abstractNum>
   <w:abstractNum w:abstractNumId="1">
+    <w:nsid w:val="130273F0"/>
+    <w:multiLevelType w:val="multilevel"/>
+    <w:tmpl w:val="0409001F"/>
+    <w:lvl w:ilvl="0">
+      <w:start w:val="1"/>
+      <w:numFmt w:val="decimal"/>
+      <w:lvlText w:val="%1."/>
+      <w:lvlJc w:val="left"/>
+      <w:pPr>
+        <w:ind w:left="360" w:hanging="360"/>
+      </w:pPr>
+    </w:lvl>
+    <w:lvl w:ilvl="1">
+      <w:start w:val="1"/>
+      <w:numFmt w:val="decimal"/>
+      <w:lvlText w:val="%1.%2."/>
+      <w:lvlJc w:val="left"/>
+      <w:pPr>
+        <w:ind w:left="792" w:hanging="432"/>
+      </w:pPr>
+    </w:lvl>
+    <w:lvl w:ilvl="2">
+      <w:start w:val="1"/>
+      <w:numFmt w:val="decimal"/>
+      <w:lvlText w:val="%1.%2.%3."/>
+      <w:lvlJc w:val="left"/>
+      <w:pPr>
+        <w:ind w:left="1224" w:hanging="504"/>
+      </w:pPr>
+    </w:lvl>
+    <w:lvl w:ilvl="3">
+      <w:start w:val="1"/>
+      <w:numFmt w:val="decimal"/>
+      <w:lvlText w:val="%1.%2.%3.%4."/>
+      <w:lvlJc w:val="left"/>
+      <w:pPr>
+        <w:ind w:left="1728" w:hanging="648"/>
+      </w:pPr>
+    </w:lvl>
+    <w:lvl w:ilvl="4">
+      <w:start w:val="1"/>
+      <w:numFmt w:val="decimal"/>
+      <w:lvlText w:val="%1.%2.%3.%4.%5."/>
+      <w:lvlJc w:val="left"/>
+      <w:pPr>
+        <w:ind w:left="2232" w:hanging="792"/>
+      </w:pPr>
+    </w:lvl>
+    <w:lvl w:ilvl="5">
+      <w:start w:val="1"/>
+      <w:numFmt w:val="decimal"/>
+      <w:lvlText w:val="%1.%2.%3.%4.%5.%6."/>
+      <w:lvlJc w:val="left"/>
+      <w:pPr>
+        <w:ind w:left="2736" w:hanging="936"/>
+      </w:pPr>
+    </w:lvl>
+    <w:lvl w:ilvl="6">
+      <w:start w:val="1"/>
+      <w:numFmt w:val="decimal"/>
+      <w:lvlText w:val="%1.%2.%3.%4.%5.%6.%7."/>
+      <w:lvlJc w:val="left"/>
+      <w:pPr>
+        <w:ind w:left="3240" w:hanging="1080"/>
+      </w:pPr>
+    </w:lvl>
+    <w:lvl w:ilvl="7">
+      <w:start w:val="1"/>
+      <w:numFmt w:val="decimal"/>
+      <w:lvlText w:val="%1.%2.%3.%4.%5.%6.%7.%8."/>
+      <w:lvlJc w:val="left"/>
+      <w:pPr>
+        <w:ind w:left="3744" w:hanging="1224"/>
+      </w:pPr>
+    </w:lvl>
+    <w:lvl w:ilvl="8">
+      <w:start w:val="1"/>
+      <w:numFmt w:val="decimal"/>
+      <w:lvlText w:val="%1.%2.%3.%4.%5.%6.%7.%8.%9."/>
+      <w:lvlJc w:val="left"/>
+      <w:pPr>
+        <w:ind w:left="4320" w:hanging="1440"/>
+      </w:pPr>
+    </w:lvl>
+  </w:abstractNum>
+  <w:abstractNum w:abstractNumId="2">
     <w:nsid w:val="1C81385B"/>
     <w:multiLevelType w:val="hybridMultilevel"/>
     <w:tmpl w:val="4EBE3440"/>
@@ -875,7 +1140,93 @@
       </w:rPr>
     </w:lvl>
   </w:abstractNum>
-  <w:abstractNum w:abstractNumId="2">
+  <w:abstractNum w:abstractNumId="3">
+    <w:nsid w:val="2E9000C9"/>
+    <w:multiLevelType w:val="multilevel"/>
+    <w:tmpl w:val="0409001F"/>
+    <w:lvl w:ilvl="0">
+      <w:start w:val="1"/>
+      <w:numFmt w:val="decimal"/>
+      <w:lvlText w:val="%1."/>
+      <w:lvlJc w:val="left"/>
+      <w:pPr>
+        <w:ind w:left="360" w:hanging="360"/>
+      </w:pPr>
+    </w:lvl>
+    <w:lvl w:ilvl="1">
+      <w:start w:val="1"/>
+      <w:numFmt w:val="decimal"/>
+      <w:lvlText w:val="%1.%2."/>
+      <w:lvlJc w:val="left"/>
+      <w:pPr>
+        <w:ind w:left="792" w:hanging="432"/>
+      </w:pPr>
+    </w:lvl>
+    <w:lvl w:ilvl="2">
+      <w:start w:val="1"/>
+      <w:numFmt w:val="decimal"/>
+      <w:lvlText w:val="%1.%2.%3."/>
+      <w:lvlJc w:val="left"/>
+      <w:pPr>
+        <w:ind w:left="1224" w:hanging="504"/>
+      </w:pPr>
+    </w:lvl>
+    <w:lvl w:ilvl="3">
+      <w:start w:val="1"/>
+      <w:numFmt w:val="decimal"/>
+      <w:lvlText w:val="%1.%2.%3.%4."/>
+      <w:lvlJc w:val="left"/>
+      <w:pPr>
+        <w:ind w:left="1728" w:hanging="648"/>
+      </w:pPr>
+    </w:lvl>
+    <w:lvl w:ilvl="4">
+      <w:start w:val="1"/>
+      <w:numFmt w:val="decimal"/>
+      <w:lvlText w:val="%1.%2.%3.%4.%5."/>
+      <w:lvlJc w:val="left"/>
+      <w:pPr>
+        <w:ind w:left="2232" w:hanging="792"/>
+      </w:pPr>
+    </w:lvl>
+    <w:lvl w:ilvl="5">
+      <w:start w:val="1"/>
+      <w:numFmt w:val="decimal"/>
+      <w:lvlText w:val="%1.%2.%3.%4.%5.%6."/>
+      <w:lvlJc w:val="left"/>
+      <w:pPr>
+        <w:ind w:left="2736" w:hanging="936"/>
+      </w:pPr>
+    </w:lvl>
+    <w:lvl w:ilvl="6">
+      <w:start w:val="1"/>
+      <w:numFmt w:val="decimal"/>
+      <w:lvlText w:val="%1.%2.%3.%4.%5.%6.%7."/>
+      <w:lvlJc w:val="left"/>
+      <w:pPr>
+        <w:ind w:left="3240" w:hanging="1080"/>
+      </w:pPr>
+    </w:lvl>
+    <w:lvl w:ilvl="7">
+      <w:start w:val="1"/>
+      <w:numFmt w:val="decimal"/>
+      <w:lvlText w:val="%1.%2.%3.%4.%5.%6.%7.%8."/>
+      <w:lvlJc w:val="left"/>
+      <w:pPr>
+        <w:ind w:left="3744" w:hanging="1224"/>
+      </w:pPr>
+    </w:lvl>
+    <w:lvl w:ilvl="8">
+      <w:start w:val="1"/>
+      <w:numFmt w:val="decimal"/>
+      <w:lvlText w:val="%1.%2.%3.%4.%5.%6.%7.%8.%9."/>
+      <w:lvlJc w:val="left"/>
+      <w:pPr>
+        <w:ind w:left="4320" w:hanging="1440"/>
+      </w:pPr>
+    </w:lvl>
+  </w:abstractNum>
+  <w:abstractNum w:abstractNumId="4">
     <w:nsid w:val="312D557F"/>
     <w:multiLevelType w:val="hybridMultilevel"/>
     <w:tmpl w:val="661CBD84"/>
@@ -988,7 +1339,7 @@
       </w:rPr>
     </w:lvl>
   </w:abstractNum>
-  <w:abstractNum w:abstractNumId="3">
+  <w:abstractNum w:abstractNumId="5">
     <w:nsid w:val="364E092B"/>
     <w:multiLevelType w:val="multilevel"/>
     <w:tmpl w:val="AED6E9BA"/>
@@ -1137,7 +1488,7 @@
       </w:rPr>
     </w:lvl>
   </w:abstractNum>
-  <w:abstractNum w:abstractNumId="4">
+  <w:abstractNum w:abstractNumId="6">
     <w:nsid w:val="561C2D5B"/>
     <w:multiLevelType w:val="hybridMultilevel"/>
     <w:tmpl w:val="69CAC8CE"/>
@@ -1250,7 +1601,7 @@
       </w:rPr>
     </w:lvl>
   </w:abstractNum>
-  <w:abstractNum w:abstractNumId="5">
+  <w:abstractNum w:abstractNumId="7">
     <w:nsid w:val="5FA80BCA"/>
     <w:multiLevelType w:val="hybridMultilevel"/>
     <w:tmpl w:val="C84A44A6"/>
@@ -1363,7 +1714,120 @@
       </w:rPr>
     </w:lvl>
   </w:abstractNum>
-  <w:abstractNum w:abstractNumId="6">
+  <w:abstractNum w:abstractNumId="8">
+    <w:nsid w:val="6F35257A"/>
+    <w:multiLevelType w:val="hybridMultilevel"/>
+    <w:tmpl w:val="50067FA8"/>
+    <w:lvl w:ilvl="0" w:tplc="04090001">
+      <w:start w:val="1"/>
+      <w:numFmt w:val="bullet"/>
+      <w:lvlText w:val=""/>
+      <w:lvlJc w:val="left"/>
+      <w:pPr>
+        <w:ind w:left="1080" w:hanging="360"/>
+      </w:pPr>
+      <w:rPr>
+        <w:rFonts w:ascii="Symbol" w:hAnsi="Symbol" w:hint="default"/>
+      </w:rPr>
+    </w:lvl>
+    <w:lvl w:ilvl="1" w:tplc="04090003">
+      <w:start w:val="1"/>
+      <w:numFmt w:val="bullet"/>
+      <w:lvlText w:val="o"/>
+      <w:lvlJc w:val="left"/>
+      <w:pPr>
+        <w:ind w:left="1800" w:hanging="360"/>
+      </w:pPr>
+      <w:rPr>
+        <w:rFonts w:ascii="Courier New" w:hAnsi="Courier New" w:cs="Courier New" w:hint="default"/>
+      </w:rPr>
+    </w:lvl>
+    <w:lvl w:ilvl="2" w:tplc="04090005" w:tentative="1">
+      <w:start w:val="1"/>
+      <w:numFmt w:val="bullet"/>
+      <w:lvlText w:val=""/>
+      <w:lvlJc w:val="left"/>
+      <w:pPr>
+        <w:ind w:left="2520" w:hanging="360"/>
+      </w:pPr>
+      <w:rPr>
+        <w:rFonts w:ascii="Wingdings" w:hAnsi="Wingdings" w:hint="default"/>
+      </w:rPr>
+    </w:lvl>
+    <w:lvl w:ilvl="3" w:tplc="04090001" w:tentative="1">
+      <w:start w:val="1"/>
+      <w:numFmt w:val="bullet"/>
+      <w:lvlText w:val=""/>
+      <w:lvlJc w:val="left"/>
+      <w:pPr>
+        <w:ind w:left="3240" w:hanging="360"/>
+      </w:pPr>
+      <w:rPr>
+        <w:rFonts w:ascii="Symbol" w:hAnsi="Symbol" w:hint="default"/>
+      </w:rPr>
+    </w:lvl>
+    <w:lvl w:ilvl="4" w:tplc="04090003" w:tentative="1">
+      <w:start w:val="1"/>
+      <w:numFmt w:val="bullet"/>
+      <w:lvlText w:val="o"/>
+      <w:lvlJc w:val="left"/>
+      <w:pPr>
+        <w:ind w:left="3960" w:hanging="360"/>
+      </w:pPr>
+      <w:rPr>
+        <w:rFonts w:ascii="Courier New" w:hAnsi="Courier New" w:cs="Courier New" w:hint="default"/>
+      </w:rPr>
+    </w:lvl>
+    <w:lvl w:ilvl="5" w:tplc="04090005" w:tentative="1">
+      <w:start w:val="1"/>
+      <w:numFmt w:val="bullet"/>
+      <w:lvlText w:val=""/>
+      <w:lvlJc w:val="left"/>
+      <w:pPr>
+        <w:ind w:left="4680" w:hanging="360"/>
+      </w:pPr>
+      <w:rPr>
+        <w:rFonts w:ascii="Wingdings" w:hAnsi="Wingdings" w:hint="default"/>
+      </w:rPr>
+    </w:lvl>
+    <w:lvl w:ilvl="6" w:tplc="04090001" w:tentative="1">
+      <w:start w:val="1"/>
+      <w:numFmt w:val="bullet"/>
+      <w:lvlText w:val=""/>
+      <w:lvlJc w:val="left"/>
+      <w:pPr>
+        <w:ind w:left="5400" w:hanging="360"/>
+      </w:pPr>
+      <w:rPr>
+        <w:rFonts w:ascii="Symbol" w:hAnsi="Symbol" w:hint="default"/>
+      </w:rPr>
+    </w:lvl>
+    <w:lvl w:ilvl="7" w:tplc="04090003" w:tentative="1">
+      <w:start w:val="1"/>
+      <w:numFmt w:val="bullet"/>
+      <w:lvlText w:val="o"/>
+      <w:lvlJc w:val="left"/>
+      <w:pPr>
+        <w:ind w:left="6120" w:hanging="360"/>
+      </w:pPr>
+      <w:rPr>
+        <w:rFonts w:ascii="Courier New" w:hAnsi="Courier New" w:cs="Courier New" w:hint="default"/>
+      </w:rPr>
+    </w:lvl>
+    <w:lvl w:ilvl="8" w:tplc="04090005" w:tentative="1">
+      <w:start w:val="1"/>
+      <w:numFmt w:val="bullet"/>
+      <w:lvlText w:val=""/>
+      <w:lvlJc w:val="left"/>
+      <w:pPr>
+        <w:ind w:left="6840" w:hanging="360"/>
+      </w:pPr>
+      <w:rPr>
+        <w:rFonts w:ascii="Wingdings" w:hAnsi="Wingdings" w:hint="default"/>
+      </w:rPr>
+    </w:lvl>
+  </w:abstractNum>
+  <w:abstractNum w:abstractNumId="9">
     <w:nsid w:val="7DD35565"/>
     <w:multiLevelType w:val="hybridMultilevel"/>
     <w:tmpl w:val="936AF78C"/>
@@ -1477,25 +1941,34 @@
     </w:lvl>
   </w:abstractNum>
   <w:num w:numId="1">
-    <w:abstractNumId w:val="3"/>
+    <w:abstractNumId w:val="5"/>
   </w:num>
   <w:num w:numId="2">
-    <w:abstractNumId w:val="6"/>
+    <w:abstractNumId w:val="9"/>
   </w:num>
   <w:num w:numId="3">
-    <w:abstractNumId w:val="1"/>
+    <w:abstractNumId w:val="2"/>
   </w:num>
   <w:num w:numId="4">
-    <w:abstractNumId w:val="2"/>
+    <w:abstractNumId w:val="4"/>
   </w:num>
   <w:num w:numId="5">
     <w:abstractNumId w:val="0"/>
   </w:num>
   <w:num w:numId="6">
-    <w:abstractNumId w:val="5"/>
+    <w:abstractNumId w:val="7"/>
   </w:num>
   <w:num w:numId="7">
-    <w:abstractNumId w:val="4"/>
+    <w:abstractNumId w:val="6"/>
+  </w:num>
+  <w:num w:numId="8">
+    <w:abstractNumId w:val="1"/>
+  </w:num>
+  <w:num w:numId="9">
+    <w:abstractNumId w:val="3"/>
+  </w:num>
+  <w:num w:numId="10">
+    <w:abstractNumId w:val="8"/>
   </w:num>
 </w:numbering>
 </file>

</xml_diff>

<commit_message>
Updated spring report 1
</commit_message>
<xml_diff>
--- a/srDesign_SprintReport1.docx
+++ b/srDesign_SprintReport1.docx
@@ -88,12 +88,7 @@
     </w:p>
     <w:p>
       <w:r>
-        <w:t>Innovative System</w:t>
-      </w:r>
-      <w:bookmarkStart w:id="0" w:name="_GoBack"/>
-      <w:bookmarkEnd w:id="0"/>
-      <w:r>
-        <w:t xml:space="preserve">s </w:t>
+        <w:t xml:space="preserve">Innovative Systems </w:t>
       </w:r>
       <w:r>
         <w:t>L.L.C.</w:t>
@@ -419,6 +414,11 @@
       </w:r>
     </w:p>
     <w:p>
+      <w:r>
+        <w:t>//TODO</w:t>
+      </w:r>
+    </w:p>
+    <w:p>
       <w:pPr>
         <w:pStyle w:val="Heading1"/>
         <w:rPr>
@@ -437,9 +437,6 @@
         <w:pStyle w:val="Heading2"/>
         <w:rPr>
           <w:rFonts w:eastAsia="Times New Roman"/>
-          <w:color w:val="365F91" w:themeColor="accent1" w:themeShade="BF"/>
-          <w:sz w:val="28"/>
-          <w:szCs w:val="28"/>
         </w:rPr>
       </w:pPr>
       <w:r>
@@ -456,6 +453,29 @@
       </w:r>
     </w:p>
     <w:p>
+      <w:r>
+        <w:t>The games that run on the STBs must be small and very efficient. STBs have very little memory available, and games have to be re-downloaded each time it is played. Therefore, all player info and statistics must be stored on the server, and then retrieved at run-time.</w:t>
+      </w:r>
+      <w:r>
+        <w:t xml:space="preserve"> </w:t>
+      </w:r>
+      <w:r>
+        <w:t>All games will be created in a custom C++/QT environment</w:t>
+      </w:r>
+      <w:r>
+        <w:t>. The server process will be written in C# and be able to</w:t>
+      </w:r>
+      <w:r>
+        <w:t xml:space="preserve"> be run o</w:t>
+      </w:r>
+      <w:r>
+        <w:t>n a W</w:t>
+      </w:r>
+      <w:r>
+        <w:t>indows/Azure server.</w:t>
+      </w:r>
+    </w:p>
+    <w:p>
       <w:pPr>
         <w:pStyle w:val="Heading2"/>
         <w:rPr>
@@ -476,6 +496,17 @@
       </w:r>
     </w:p>
     <w:p>
+      <w:r>
+        <w:t xml:space="preserve">This project is a continuation off of the 2011/2012 Set Top Box Game project, which was also hosted by Innovative Systems. </w:t>
+      </w:r>
+      <w:r>
+        <w:t xml:space="preserve">The reason for wanting multi-player games is simply that playing games with other people is more fun than being limited to playing alone. </w:t>
+      </w:r>
+      <w:r>
+        <w:t xml:space="preserve">This will keep customers interested in the game feature and will make Innovative Systems product more marketable. </w:t>
+      </w:r>
+    </w:p>
+    <w:p>
       <w:pPr>
         <w:pStyle w:val="Heading3"/>
         <w:rPr>
@@ -487,6 +518,11 @@
           <w:rFonts w:eastAsia="Times New Roman"/>
         </w:rPr>
         <w:t>Technical Environment</w:t>
+      </w:r>
+    </w:p>
+    <w:p>
+      <w:r>
+        <w:t>//TODO</w:t>
       </w:r>
     </w:p>
     <w:p>
@@ -513,15 +549,7 @@
         <w:ind w:left="720"/>
       </w:pPr>
       <w:r>
-        <w:t xml:space="preserve">The games will run on Amino Set Top Boxes. These STBs run a custom build of QT, </w:t>
-      </w:r>
-      <w:proofErr w:type="spellStart"/>
-      <w:r>
-        <w:t>binded</w:t>
-      </w:r>
-      <w:proofErr w:type="spellEnd"/>
-      <w:r>
-        <w:t xml:space="preserve"> to C++. The game server software will be written in C# and must be able to run under .NET 4.5. The server should be able to operate in a Windows or Azure operating system. </w:t>
+        <w:t xml:space="preserve">The games will run on Amino Set Top Boxes. These STBs run a custom build of QT, binded to C++. The game server software will be written in C# and must be able to run under .NET 4.5. The server should be able to operate in a Windows or Azure operating system. </w:t>
       </w:r>
     </w:p>
     <w:p>
@@ -768,6 +796,7 @@
         </w:rPr>
       </w:pPr>
       <w:r>
+        <w:lastRenderedPageBreak/>
         <w:t>Backlog Outline</w:t>
       </w:r>
     </w:p>
@@ -781,6 +810,15 @@
           <w:szCs w:val="24"/>
         </w:rPr>
       </w:pPr>
+      <w:r>
+        <w:rPr>
+          <w:rFonts w:ascii="Times New Roman" w:eastAsia="Times New Roman" w:hAnsi="Times New Roman" w:cs="Times New Roman"/>
+          <w:color w:val="000000"/>
+          <w:sz w:val="24"/>
+          <w:szCs w:val="24"/>
+        </w:rPr>
+        <w:t>//TODO</w:t>
+      </w:r>
     </w:p>
     <w:p>
       <w:pPr>
@@ -805,16 +843,22 @@
         </w:numPr>
       </w:pPr>
       <w:r>
-        <w:t xml:space="preserve">STB Runtime design using </w:t>
-      </w:r>
-      <w:proofErr w:type="spellStart"/>
-      <w:r>
-        <w:t>QtUILoader</w:t>
-      </w:r>
-      <w:proofErr w:type="spellEnd"/>
-      <w:r>
-        <w:t xml:space="preserve"> (can’t test until v9 is stable)</w:t>
-      </w:r>
+        <w:t>STB Runtime design using QtUILoader (can’t test until v9 is stable)</w:t>
+      </w:r>
+    </w:p>
+    <w:p>
+      <w:pPr>
+        <w:pStyle w:val="ListParagraph"/>
+        <w:numPr>
+          <w:ilvl w:val="0"/>
+          <w:numId w:val="7"/>
+        </w:numPr>
+      </w:pPr>
+      <w:r>
+        <w:t>Set Top Box memory constraints</w:t>
+      </w:r>
+      <w:bookmarkStart w:id="0" w:name="_GoBack"/>
+      <w:bookmarkEnd w:id="0"/>
     </w:p>
     <w:sectPr>
       <w:pgSz w:w="12240" w:h="15840"/>

</xml_diff>